<commit_message>
finish until screen flow
</commit_message>
<xml_diff>
--- a/Template/Software Requirement Specification_v0.1.docx
+++ b/Template/Software Requirement Specification_v0.1.docx
@@ -1,6 +1,6 @@
 
 <file path=word/document.xml><?xml version="1.0" encoding="utf-8"?>
-<w:document xmlns:wpc="http://schemas.microsoft.com/office/word/2010/wordprocessingCanvas" xmlns:cx="http://schemas.microsoft.com/office/drawing/2014/chartex" xmlns:cx1="http://schemas.microsoft.com/office/drawing/2015/9/8/chartex" xmlns:cx2="http://schemas.microsoft.com/office/drawing/2015/10/21/chartex" xmlns:cx3="http://schemas.microsoft.com/office/drawing/2016/5/9/chartex" xmlns:cx4="http://schemas.microsoft.com/office/drawing/2016/5/10/chartex" xmlns:cx5="http://schemas.microsoft.com/office/drawing/2016/5/11/chartex" xmlns:cx6="http://schemas.microsoft.com/office/drawing/2016/5/12/chartex" xmlns:cx7="http://schemas.microsoft.com/office/drawing/2016/5/13/chartex" xmlns:cx8="http://schemas.microsoft.com/office/drawing/2016/5/14/chartex" xmlns:mc="http://schemas.openxmlformats.org/markup-compatibility/2006" xmlns:aink="http://schemas.microsoft.com/office/drawing/2016/ink" xmlns:am3d="http://schemas.microsoft.com/office/drawing/2017/model3d" xmlns:o="urn:schemas-microsoft-com:office:office" xmlns:r="http://schemas.openxmlformats.org/officeDocument/2006/relationships" xmlns:m="http://schemas.openxmlformats.org/officeDocument/2006/math" xmlns:v="urn:schemas-microsoft-com:vml" xmlns:wp14="http://schemas.microsoft.com/office/word/2010/wordprocessingDrawing" xmlns:wp="http://schemas.openxmlformats.org/drawingml/2006/wordprocessingDrawing" xmlns:w10="urn:schemas-microsoft-com:office:word" xmlns:w="http://schemas.openxmlformats.org/wordprocessingml/2006/main" xmlns:w14="http://schemas.microsoft.com/office/word/2010/wordml" xmlns:w15="http://schemas.microsoft.com/office/word/2012/wordml" xmlns:w16cex="http://schemas.microsoft.com/office/word/2018/wordml/cex" xmlns:w16cid="http://schemas.microsoft.com/office/word/2016/wordml/cid" xmlns:w16="http://schemas.microsoft.com/office/word/2018/wordml" xmlns:w16sdtdh="http://schemas.microsoft.com/office/word/2020/wordml/sdtdatahash" xmlns:w16se="http://schemas.microsoft.com/office/word/2015/wordml/symex" xmlns:wpg="http://schemas.microsoft.com/office/word/2010/wordprocessingGroup" xmlns:wpi="http://schemas.microsoft.com/office/word/2010/wordprocessingInk" xmlns:wne="http://schemas.microsoft.com/office/word/2006/wordml" xmlns:wps="http://schemas.microsoft.com/office/word/2010/wordprocessingShape" mc:Ignorable="w14 w15 w16se w16cid w16 w16cex w16sdtdh wp14">
+<w:document xmlns:wpc="http://schemas.microsoft.com/office/word/2010/wordprocessingCanvas" xmlns:cx="http://schemas.microsoft.com/office/drawing/2014/chartex" xmlns:cx1="http://schemas.microsoft.com/office/drawing/2015/9/8/chartex" xmlns:cx2="http://schemas.microsoft.com/office/drawing/2015/10/21/chartex" xmlns:cx3="http://schemas.microsoft.com/office/drawing/2016/5/9/chartex" xmlns:cx4="http://schemas.microsoft.com/office/drawing/2016/5/10/chartex" xmlns:cx5="http://schemas.microsoft.com/office/drawing/2016/5/11/chartex" xmlns:cx6="http://schemas.microsoft.com/office/drawing/2016/5/12/chartex" xmlns:cx7="http://schemas.microsoft.com/office/drawing/2016/5/13/chartex" xmlns:cx8="http://schemas.microsoft.com/office/drawing/2016/5/14/chartex" xmlns:mc="http://schemas.openxmlformats.org/markup-compatibility/2006" xmlns:aink="http://schemas.microsoft.com/office/drawing/2016/ink" xmlns:am3d="http://schemas.microsoft.com/office/drawing/2017/model3d" xmlns:o="urn:schemas-microsoft-com:office:office" xmlns:oel="http://schemas.microsoft.com/office/2019/extlst" xmlns:r="http://schemas.openxmlformats.org/officeDocument/2006/relationships" xmlns:m="http://schemas.openxmlformats.org/officeDocument/2006/math" xmlns:v="urn:schemas-microsoft-com:vml" xmlns:wp14="http://schemas.microsoft.com/office/word/2010/wordprocessingDrawing" xmlns:wp="http://schemas.openxmlformats.org/drawingml/2006/wordprocessingDrawing" xmlns:w10="urn:schemas-microsoft-com:office:word" xmlns:w="http://schemas.openxmlformats.org/wordprocessingml/2006/main" xmlns:w14="http://schemas.microsoft.com/office/word/2010/wordml" xmlns:w15="http://schemas.microsoft.com/office/word/2012/wordml" xmlns:w16cex="http://schemas.microsoft.com/office/word/2018/wordml/cex" xmlns:w16cid="http://schemas.microsoft.com/office/word/2016/wordml/cid" xmlns:w16="http://schemas.microsoft.com/office/word/2018/wordml" xmlns:w16du="http://schemas.microsoft.com/office/word/2023/wordml/word16du" xmlns:w16sdtdh="http://schemas.microsoft.com/office/word/2020/wordml/sdtdatahash" xmlns:w16sdtfl="http://schemas.microsoft.com/office/word/2024/wordml/sdtformatlock" xmlns:w16se="http://schemas.microsoft.com/office/word/2015/wordml/symex" xmlns:wpg="http://schemas.microsoft.com/office/word/2010/wordprocessingGroup" xmlns:wpi="http://schemas.microsoft.com/office/word/2010/wordprocessingInk" xmlns:wne="http://schemas.microsoft.com/office/word/2006/wordml" xmlns:wps="http://schemas.microsoft.com/office/word/2010/wordprocessingShape" mc:Ignorable="w14 w15 w16se w16cid w16 w16cex w16sdtdh w16sdtfl w16du wp14">
   <w:body>
     <w:p/>
     <w:p>
@@ -243,7 +243,6 @@
           <w:docPartUnique/>
         </w:docPartObj>
       </w:sdtPr>
-      <w:sdtEndPr/>
       <w:sdtContent>
         <w:p>
           <w:pPr>
@@ -3304,51 +3303,31 @@
     <w:p>
       <w:pPr>
         <w:jc w:val="both"/>
-        <w:rPr>
-          <w:i/>
-          <w:color w:val="0000FF"/>
-        </w:rPr>
-      </w:pPr>
-      <w:r>
-        <w:rPr>
-          <w:i/>
-          <w:color w:val="0000FF"/>
-        </w:rPr>
-        <w:t>[Gives the overall description about the product with some introduction and the context diagram. The context diagram presents the boundary and connections between the system you’re developing and everything else in the universe. This identifies external entities (or terminators – software, hardware, human components, and other systems) outside the system that interface to it in some way, as well as data, control, and material flows between the terminators and the system.]</w:t>
-      </w:r>
-    </w:p>
-    <w:p>
-      <w:pPr>
-        <w:jc w:val="both"/>
-      </w:pPr>
-      <w:r>
-        <w:t>&lt;&lt;Sample: The Cafeteria Ordering System is a new software system that replaces the current manual and telephone processes for ordering and picking up meals in the Process Impact cafeteria. The context diagram below illustrates the external entities and system interfaces for release 1.0. The system is expected to evolve over several releases, ultimately connecting to the Internet ordering services for several local restaurants and to credit and debit card authorization services.</w:t>
-      </w:r>
-    </w:p>
-    <w:p>
-      <w:pPr>
-        <w:jc w:val="center"/>
-      </w:pPr>
+      </w:pPr>
+      <w:r>
+        <w:t>The Healthcare Clinic Management System (HCMS) is a new software solution designed to replace current manual and telephone-based processes at a private paediatric clinic. The context diagram illustrates the external entities and system interfaces for the MVP version (v1.0), focusing on optimizing the data flow between parents, doctors, and the reception desk. The system is designed for a lean operational scale of 1-2 doctors and 1 receptionist, with the goal of eliminating administrative bottlenecks and fully digitizing electronic medical records (EMR). It is built upon a core data structure of 5 essential entities—Patient, Appointment, Visit, Prescription, and Billing—while strictly excluding complex features such as health insurance integration or advanced pharmacy inventory management to ensure rapid deployment.</w:t>
+      </w:r>
       <w:r>
         <w:rPr>
           <w:noProof/>
         </w:rPr>
         <w:drawing>
-          <wp:inline distT="0" distB="0" distL="0" distR="0" wp14:anchorId="220B56ED" wp14:editId="28128F93">
-            <wp:extent cx="4330342" cy="3315587"/>
-            <wp:effectExtent l="0" t="0" r="0" b="0"/>
-            <wp:docPr id="26" name="image6.png"/>
-            <wp:cNvGraphicFramePr/>
+          <wp:inline distT="0" distB="0" distL="0" distR="0" wp14:anchorId="29B4F699" wp14:editId="33940997">
+            <wp:extent cx="5746750" cy="3738880"/>
+            <wp:effectExtent l="0" t="0" r="6350" b="0"/>
+            <wp:docPr id="465058204" name="Picture 1"/>
+            <wp:cNvGraphicFramePr>
+              <a:graphicFrameLocks xmlns:a="http://schemas.openxmlformats.org/drawingml/2006/main" noChangeAspect="1"/>
+            </wp:cNvGraphicFramePr>
             <a:graphic xmlns:a="http://schemas.openxmlformats.org/drawingml/2006/main">
               <a:graphicData uri="http://schemas.openxmlformats.org/drawingml/2006/picture">
                 <pic:pic xmlns:pic="http://schemas.openxmlformats.org/drawingml/2006/picture">
                   <pic:nvPicPr>
-                    <pic:cNvPr id="0" name="image6.png"/>
-                    <pic:cNvPicPr preferRelativeResize="0"/>
+                    <pic:cNvPr id="465058204" name=""/>
+                    <pic:cNvPicPr/>
                   </pic:nvPicPr>
                   <pic:blipFill>
                     <a:blip r:embed="rId9"/>
-                    <a:srcRect/>
                     <a:stretch>
                       <a:fillRect/>
                     </a:stretch>
@@ -3356,12 +3335,11 @@
                   <pic:spPr>
                     <a:xfrm>
                       <a:off x="0" y="0"/>
-                      <a:ext cx="4330342" cy="3315587"/>
+                      <a:ext cx="5746750" cy="3738880"/>
                     </a:xfrm>
                     <a:prstGeom prst="rect">
                       <a:avLst/>
                     </a:prstGeom>
-                    <a:ln/>
                   </pic:spPr>
                 </pic:pic>
               </a:graphicData>
@@ -3371,11 +3349,6 @@
       </w:r>
     </w:p>
     <w:p>
-      <w:r>
-        <w:t>&gt;&gt;</w:t>
-      </w:r>
-    </w:p>
-    <w:p>
       <w:pPr>
         <w:rPr>
           <w:b/>
@@ -3407,22 +3380,6 @@
     </w:p>
     <w:p>
       <w:pPr>
-        <w:spacing w:after="60" w:line="240" w:lineRule="auto"/>
-        <w:rPr>
-          <w:i/>
-          <w:color w:val="0000FF"/>
-        </w:rPr>
-      </w:pPr>
-      <w:r>
-        <w:rPr>
-          <w:i/>
-          <w:color w:val="0000FF"/>
-        </w:rPr>
-        <w:t>[Provide main workflows (business processes) using the swim-lane diagram(s) like sample below]</w:t>
-      </w:r>
-    </w:p>
-    <w:p>
-      <w:pPr>
         <w:pStyle w:val="Heading4"/>
       </w:pPr>
       <w:r>
@@ -3432,7 +3389,10 @@
         <w:t>2</w:t>
       </w:r>
       <w:r>
-        <w:t>.1 Order Processing</w:t>
+        <w:t xml:space="preserve">.1 </w:t>
+      </w:r>
+      <w:r>
+        <w:t>Self-Service Booking</w:t>
       </w:r>
     </w:p>
     <w:p>
@@ -3441,21 +3401,22 @@
           <w:noProof/>
         </w:rPr>
         <w:drawing>
-          <wp:inline distT="0" distB="0" distL="0" distR="0" wp14:anchorId="6B1ACD32" wp14:editId="7E3EEC59">
-            <wp:extent cx="5746750" cy="2310765"/>
-            <wp:effectExtent l="0" t="0" r="0" b="0"/>
-            <wp:docPr id="25" name="image3.png"/>
-            <wp:cNvGraphicFramePr/>
+          <wp:inline distT="0" distB="0" distL="0" distR="0" wp14:anchorId="6B75E542" wp14:editId="46864B0D">
+            <wp:extent cx="5746750" cy="2880995"/>
+            <wp:effectExtent l="0" t="0" r="6350" b="0"/>
+            <wp:docPr id="375733113" name="Picture 1"/>
+            <wp:cNvGraphicFramePr>
+              <a:graphicFrameLocks xmlns:a="http://schemas.openxmlformats.org/drawingml/2006/main" noChangeAspect="1"/>
+            </wp:cNvGraphicFramePr>
             <a:graphic xmlns:a="http://schemas.openxmlformats.org/drawingml/2006/main">
               <a:graphicData uri="http://schemas.openxmlformats.org/drawingml/2006/picture">
                 <pic:pic xmlns:pic="http://schemas.openxmlformats.org/drawingml/2006/picture">
                   <pic:nvPicPr>
-                    <pic:cNvPr id="0" name="image3.png"/>
-                    <pic:cNvPicPr preferRelativeResize="0"/>
+                    <pic:cNvPr id="375733113" name=""/>
+                    <pic:cNvPicPr/>
                   </pic:nvPicPr>
                   <pic:blipFill>
                     <a:blip r:embed="rId10"/>
-                    <a:srcRect/>
                     <a:stretch>
                       <a:fillRect/>
                     </a:stretch>
@@ -3463,12 +3424,11 @@
                   <pic:spPr>
                     <a:xfrm>
                       <a:off x="0" y="0"/>
-                      <a:ext cx="5746750" cy="2310765"/>
+                      <a:ext cx="5746750" cy="2880995"/>
                     </a:xfrm>
                     <a:prstGeom prst="rect">
                       <a:avLst/>
                     </a:prstGeom>
-                    <a:ln/>
                   </pic:spPr>
                 </pic:pic>
               </a:graphicData>
@@ -3488,7 +3448,10 @@
         <w:t>2</w:t>
       </w:r>
       <w:r>
-        <w:t>.2 Customer Support</w:t>
+        <w:t xml:space="preserve">.2 </w:t>
+      </w:r>
+      <w:r>
+        <w:t>Clinical Consultation &amp; EMR</w:t>
       </w:r>
     </w:p>
     <w:p>
@@ -3496,1260 +3459,23 @@
         <w:rPr>
           <w:noProof/>
         </w:rPr>
-        <w:t>…</w:t>
-      </w:r>
-    </w:p>
-    <w:p/>
-    <w:p>
-      <w:pPr>
-        <w:pStyle w:val="Heading3"/>
-      </w:pPr>
-      <w:bookmarkStart w:id="5" w:name="_Toc187341935"/>
-      <w:r>
-        <w:t>1.</w:t>
-      </w:r>
-      <w:r>
-        <w:t>3</w:t>
-      </w:r>
-      <w:r>
-        <w:t xml:space="preserve"> User Requirements</w:t>
-      </w:r>
-      <w:bookmarkEnd w:id="5"/>
-    </w:p>
-    <w:p>
-      <w:pPr>
-        <w:pStyle w:val="Heading4"/>
-      </w:pPr>
-      <w:r>
-        <w:t>1.</w:t>
-      </w:r>
-      <w:r>
-        <w:t>3</w:t>
-      </w:r>
-      <w:r>
-        <w:t>.1 Actors</w:t>
-      </w:r>
-    </w:p>
-    <w:p>
-      <w:pPr>
-        <w:jc w:val="both"/>
-        <w:rPr>
-          <w:i/>
-          <w:color w:val="0000FF"/>
-        </w:rPr>
-      </w:pPr>
-      <w:r>
-        <w:rPr>
-          <w:i/>
-          <w:color w:val="0000FF"/>
-        </w:rPr>
-        <w:t xml:space="preserve">[An actor is someone/something that interacts with the system. </w:t>
-      </w:r>
-    </w:p>
-    <w:p>
-      <w:pPr>
-        <w:numPr>
-          <w:ilvl w:val="0"/>
-          <w:numId w:val="6"/>
-        </w:numPr>
-        <w:pBdr>
-          <w:top w:val="nil"/>
-          <w:left w:val="nil"/>
-          <w:bottom w:val="nil"/>
-          <w:right w:val="nil"/>
-          <w:between w:val="nil"/>
-        </w:pBdr>
-        <w:spacing w:after="0"/>
-        <w:ind w:left="426" w:hanging="283"/>
-        <w:rPr>
-          <w:i/>
-          <w:color w:val="0000FF"/>
-        </w:rPr>
-      </w:pPr>
-      <w:r>
-        <w:rPr>
-          <w:i/>
-          <w:color w:val="0000FF"/>
-        </w:rPr>
-        <w:t>The only external entities that interact with the system</w:t>
-      </w:r>
-    </w:p>
-    <w:p>
-      <w:pPr>
-        <w:numPr>
-          <w:ilvl w:val="0"/>
-          <w:numId w:val="6"/>
-        </w:numPr>
-        <w:pBdr>
-          <w:top w:val="nil"/>
-          <w:left w:val="nil"/>
-          <w:bottom w:val="nil"/>
-          <w:right w:val="nil"/>
-          <w:between w:val="nil"/>
-        </w:pBdr>
-        <w:spacing w:after="0"/>
-        <w:ind w:left="426" w:hanging="283"/>
-        <w:rPr>
-          <w:i/>
-          <w:color w:val="0000FF"/>
-        </w:rPr>
-      </w:pPr>
-      <w:r>
-        <w:rPr>
-          <w:i/>
-          <w:color w:val="0000FF"/>
-        </w:rPr>
-        <w:t>﻿Actors are outside the system and not part of it</w:t>
-      </w:r>
-    </w:p>
-    <w:p>
-      <w:pPr>
-        <w:numPr>
-          <w:ilvl w:val="0"/>
-          <w:numId w:val="6"/>
-        </w:numPr>
-        <w:pBdr>
-          <w:top w:val="nil"/>
-          <w:left w:val="nil"/>
-          <w:bottom w:val="nil"/>
-          <w:right w:val="nil"/>
-          <w:between w:val="nil"/>
-        </w:pBdr>
-        <w:spacing w:after="0"/>
-        <w:ind w:left="426" w:hanging="283"/>
-        <w:rPr>
-          <w:i/>
-          <w:color w:val="0000FF"/>
-        </w:rPr>
-      </w:pPr>
-      <w:r>
-        <w:rPr>
-          <w:i/>
-          <w:color w:val="0000FF"/>
-        </w:rPr>
-        <w:t>﻿A user is an individual, whereas an actor represents the role played by all users of the same type</w:t>
-      </w:r>
-    </w:p>
-    <w:p>
-      <w:pPr>
-        <w:numPr>
-          <w:ilvl w:val="0"/>
-          <w:numId w:val="6"/>
-        </w:numPr>
-        <w:pBdr>
-          <w:top w:val="nil"/>
-          <w:left w:val="nil"/>
-          <w:bottom w:val="nil"/>
-          <w:right w:val="nil"/>
-          <w:between w:val="nil"/>
-        </w:pBdr>
-        <w:ind w:left="426" w:hanging="283"/>
-        <w:rPr>
-          <w:i/>
-          <w:color w:val="0000FF"/>
-        </w:rPr>
-      </w:pPr>
-      <w:r>
-        <w:rPr>
-          <w:i/>
-          <w:color w:val="0000FF"/>
-        </w:rPr>
-        <w:t>There are other types of actors in addition to or in place of human actors: external systems, I/O devices, or timers</w:t>
-      </w:r>
-    </w:p>
-    <w:p>
-      <w:pPr>
-        <w:jc w:val="both"/>
-        <w:rPr>
-          <w:i/>
-          <w:color w:val="0000FF"/>
-        </w:rPr>
-      </w:pPr>
-      <w:r>
-        <w:rPr>
-          <w:i/>
-          <w:color w:val="0000FF"/>
-        </w:rPr>
-        <w:t>Following are some questions you might ask to help user representatives identify actors</w:t>
-      </w:r>
-    </w:p>
-    <w:p>
-      <w:pPr>
-        <w:numPr>
-          <w:ilvl w:val="0"/>
-          <w:numId w:val="6"/>
-        </w:numPr>
-        <w:pBdr>
-          <w:top w:val="nil"/>
-          <w:left w:val="nil"/>
-          <w:bottom w:val="nil"/>
-          <w:right w:val="nil"/>
-          <w:between w:val="nil"/>
-        </w:pBdr>
-        <w:spacing w:after="0"/>
-        <w:ind w:left="426" w:hanging="283"/>
-        <w:rPr>
-          <w:i/>
-          <w:color w:val="0000FF"/>
-        </w:rPr>
-      </w:pPr>
-      <w:r>
-        <w:rPr>
-          <w:i/>
-          <w:color w:val="0000FF"/>
-        </w:rPr>
-        <w:t>Who (or what) is notified when something occurs within the system?</w:t>
-      </w:r>
-    </w:p>
-    <w:p>
-      <w:pPr>
-        <w:numPr>
-          <w:ilvl w:val="0"/>
-          <w:numId w:val="6"/>
-        </w:numPr>
-        <w:pBdr>
-          <w:top w:val="nil"/>
-          <w:left w:val="nil"/>
-          <w:bottom w:val="nil"/>
-          <w:right w:val="nil"/>
-          <w:between w:val="nil"/>
-        </w:pBdr>
-        <w:spacing w:after="0"/>
-        <w:ind w:left="426" w:hanging="283"/>
-        <w:rPr>
-          <w:i/>
-          <w:color w:val="0000FF"/>
-        </w:rPr>
-      </w:pPr>
-      <w:r>
-        <w:rPr>
-          <w:i/>
-          <w:color w:val="0000FF"/>
-        </w:rPr>
-        <w:t>Who (or what) provides information or services to the system?</w:t>
-      </w:r>
-    </w:p>
-    <w:p>
-      <w:pPr>
-        <w:numPr>
-          <w:ilvl w:val="0"/>
-          <w:numId w:val="6"/>
-        </w:numPr>
-        <w:pBdr>
-          <w:top w:val="nil"/>
-          <w:left w:val="nil"/>
-          <w:bottom w:val="nil"/>
-          <w:right w:val="nil"/>
-          <w:between w:val="nil"/>
-        </w:pBdr>
-        <w:ind w:left="426" w:hanging="283"/>
-        <w:rPr>
-          <w:i/>
-          <w:color w:val="0000FF"/>
-        </w:rPr>
-      </w:pPr>
-      <w:r>
-        <w:rPr>
-          <w:i/>
-          <w:color w:val="0000FF"/>
-        </w:rPr>
-        <w:t>Who (or what) helps the system respond to and complete a task?</w:t>
-      </w:r>
-    </w:p>
-    <w:p>
-      <w:pPr>
-        <w:spacing w:after="60" w:line="240" w:lineRule="auto"/>
-        <w:rPr>
-          <w:i/>
-          <w:color w:val="0000FF"/>
-        </w:rPr>
-      </w:pPr>
-      <w:r>
-        <w:rPr>
-          <w:i/>
-          <w:color w:val="0000FF"/>
-        </w:rPr>
-        <w:t>This part gives the description of system actors, you can follow the table form as below]</w:t>
-      </w:r>
-    </w:p>
-    <w:tbl>
-      <w:tblPr>
-        <w:tblStyle w:val="a0"/>
-        <w:tblW w:w="8920" w:type="dxa"/>
-        <w:tblInd w:w="137" w:type="dxa"/>
-        <w:tblBorders>
-          <w:top w:val="single" w:sz="8" w:space="0" w:color="000000"/>
-          <w:left w:val="single" w:sz="8" w:space="0" w:color="000000"/>
-          <w:bottom w:val="single" w:sz="8" w:space="0" w:color="000000"/>
-          <w:right w:val="single" w:sz="8" w:space="0" w:color="000000"/>
-          <w:insideH w:val="single" w:sz="8" w:space="0" w:color="000000"/>
-          <w:insideV w:val="single" w:sz="8" w:space="0" w:color="000000"/>
-        </w:tblBorders>
-        <w:tblLayout w:type="fixed"/>
-        <w:tblLook w:val="0400" w:firstRow="0" w:lastRow="0" w:firstColumn="0" w:lastColumn="0" w:noHBand="0" w:noVBand="1"/>
-      </w:tblPr>
-      <w:tblGrid>
-        <w:gridCol w:w="416"/>
-        <w:gridCol w:w="1707"/>
-        <w:gridCol w:w="6797"/>
-      </w:tblGrid>
-      <w:tr>
-        <w:trPr>
-          <w:trHeight w:val="67"/>
-        </w:trPr>
-        <w:tc>
-          <w:tcPr>
-            <w:tcW w:w="416" w:type="dxa"/>
-            <w:shd w:val="clear" w:color="auto" w:fill="FFE8E1"/>
-            <w:vAlign w:val="center"/>
-          </w:tcPr>
-          <w:p>
-            <w:pPr>
-              <w:spacing w:after="0" w:line="240" w:lineRule="auto"/>
-              <w:jc w:val="center"/>
-              <w:rPr>
-                <w:b/>
-              </w:rPr>
-            </w:pPr>
-            <w:r>
-              <w:rPr>
-                <w:b/>
-              </w:rPr>
-              <w:t>#</w:t>
-            </w:r>
-          </w:p>
-        </w:tc>
-        <w:tc>
-          <w:tcPr>
-            <w:tcW w:w="1707" w:type="dxa"/>
-            <w:shd w:val="clear" w:color="auto" w:fill="FFE8E1"/>
-            <w:vAlign w:val="center"/>
-          </w:tcPr>
-          <w:p>
-            <w:pPr>
-              <w:spacing w:after="0" w:line="240" w:lineRule="auto"/>
-              <w:rPr>
-                <w:b/>
-              </w:rPr>
-            </w:pPr>
-            <w:r>
-              <w:rPr>
-                <w:b/>
-              </w:rPr>
-              <w:t>Actor</w:t>
-            </w:r>
-          </w:p>
-        </w:tc>
-        <w:tc>
-          <w:tcPr>
-            <w:tcW w:w="6797" w:type="dxa"/>
-            <w:shd w:val="clear" w:color="auto" w:fill="FFE8E1"/>
-            <w:vAlign w:val="center"/>
-          </w:tcPr>
-          <w:p>
-            <w:pPr>
-              <w:spacing w:after="0" w:line="240" w:lineRule="auto"/>
-              <w:rPr>
-                <w:b/>
-              </w:rPr>
-            </w:pPr>
-            <w:r>
-              <w:rPr>
-                <w:b/>
-              </w:rPr>
-              <w:t>Description</w:t>
-            </w:r>
-          </w:p>
-        </w:tc>
-      </w:tr>
-      <w:tr>
-        <w:tc>
-          <w:tcPr>
-            <w:tcW w:w="416" w:type="dxa"/>
-            <w:shd w:val="clear" w:color="auto" w:fill="auto"/>
-            <w:vAlign w:val="center"/>
-          </w:tcPr>
-          <w:p>
-            <w:pPr>
-              <w:ind w:left="34"/>
-            </w:pPr>
-            <w:r>
-              <w:t>1</w:t>
-            </w:r>
-          </w:p>
-        </w:tc>
-        <w:tc>
-          <w:tcPr>
-            <w:tcW w:w="1707" w:type="dxa"/>
-            <w:shd w:val="clear" w:color="auto" w:fill="auto"/>
-            <w:vAlign w:val="center"/>
-          </w:tcPr>
-          <w:p>
-            <w:r>
-              <w:t>Administrator</w:t>
-            </w:r>
-          </w:p>
-        </w:tc>
-        <w:tc>
-          <w:tcPr>
-            <w:tcW w:w="6797" w:type="dxa"/>
-            <w:shd w:val="clear" w:color="auto" w:fill="auto"/>
-            <w:vAlign w:val="center"/>
-          </w:tcPr>
-          <w:p>
-            <w:r>
-              <w:t>Actor description here..</w:t>
-            </w:r>
-          </w:p>
-        </w:tc>
-      </w:tr>
-      <w:tr>
-        <w:trPr>
-          <w:trHeight w:val="315"/>
-        </w:trPr>
-        <w:tc>
-          <w:tcPr>
-            <w:tcW w:w="416" w:type="dxa"/>
-            <w:shd w:val="clear" w:color="auto" w:fill="auto"/>
-            <w:vAlign w:val="center"/>
-          </w:tcPr>
-          <w:p>
-            <w:pPr>
-              <w:ind w:left="34"/>
-            </w:pPr>
-            <w:r>
-              <w:t>2</w:t>
-            </w:r>
-          </w:p>
-        </w:tc>
-        <w:tc>
-          <w:tcPr>
-            <w:tcW w:w="1707" w:type="dxa"/>
-            <w:shd w:val="clear" w:color="auto" w:fill="auto"/>
-            <w:vAlign w:val="center"/>
-          </w:tcPr>
-          <w:p>
-            <w:r>
-              <w:t>Menu Manager</w:t>
-            </w:r>
-          </w:p>
-        </w:tc>
-        <w:tc>
-          <w:tcPr>
-            <w:tcW w:w="6797" w:type="dxa"/>
-            <w:shd w:val="clear" w:color="auto" w:fill="auto"/>
-            <w:vAlign w:val="center"/>
-          </w:tcPr>
-          <w:p>
-            <w:r>
-              <w:t>..</w:t>
-            </w:r>
-          </w:p>
-        </w:tc>
-      </w:tr>
-      <w:tr>
-        <w:tc>
-          <w:tcPr>
-            <w:tcW w:w="416" w:type="dxa"/>
-            <w:shd w:val="clear" w:color="auto" w:fill="auto"/>
-            <w:vAlign w:val="center"/>
-          </w:tcPr>
-          <w:p>
-            <w:pPr>
-              <w:ind w:left="34"/>
-            </w:pPr>
-            <w:r>
-              <w:t>3</w:t>
-            </w:r>
-          </w:p>
-        </w:tc>
-        <w:tc>
-          <w:tcPr>
-            <w:tcW w:w="1707" w:type="dxa"/>
-            <w:shd w:val="clear" w:color="auto" w:fill="auto"/>
-            <w:vAlign w:val="center"/>
-          </w:tcPr>
-          <w:p>
-            <w:r>
-              <w:t>…</w:t>
-            </w:r>
-          </w:p>
-        </w:tc>
-        <w:tc>
-          <w:tcPr>
-            <w:tcW w:w="6797" w:type="dxa"/>
-            <w:shd w:val="clear" w:color="auto" w:fill="auto"/>
-            <w:vAlign w:val="center"/>
-          </w:tcPr>
-          <w:p/>
-        </w:tc>
-      </w:tr>
-    </w:tbl>
-    <w:p/>
-    <w:p>
-      <w:pPr>
-        <w:pStyle w:val="Heading4"/>
-      </w:pPr>
-      <w:r>
-        <w:t>1.3.2 Use Cases (UC)</w:t>
-      </w:r>
-    </w:p>
-    <w:p>
-      <w:pPr>
-        <w:jc w:val="both"/>
-        <w:rPr>
-          <w:i/>
-          <w:color w:val="0000FF"/>
-        </w:rPr>
-      </w:pPr>
-      <w:r>
-        <w:rPr>
-          <w:i/>
-          <w:color w:val="0000FF"/>
-        </w:rPr>
-        <w:t xml:space="preserve">[A use case (UC) describes a sequence of interactions between a system and an external actor that results in the actor being able to achieve some outcome of value. The names of use cases are always </w:t>
-      </w:r>
-      <w:r>
-        <w:rPr>
-          <w:i/>
-          <w:color w:val="0000FF"/>
-        </w:rPr>
-        <w:lastRenderedPageBreak/>
-        <w:t>written in the form of a verb followed by an object. Select strong, descriptive names to make it evident from the name that the use case will deliver something valuable for some user.</w:t>
-      </w:r>
-    </w:p>
-    <w:p>
-      <w:pPr>
-        <w:rPr>
-          <w:i/>
-          <w:color w:val="0000FF"/>
-        </w:rPr>
-      </w:pPr>
-      <w:r>
-        <w:rPr>
-          <w:i/>
-          <w:color w:val="0000FF"/>
-        </w:rPr>
-        <w:t>Following are some questions you might ask to help user representatives identify use cases</w:t>
-      </w:r>
-    </w:p>
-    <w:p>
-      <w:pPr>
-        <w:numPr>
-          <w:ilvl w:val="0"/>
-          <w:numId w:val="6"/>
-        </w:numPr>
-        <w:pBdr>
-          <w:top w:val="nil"/>
-          <w:left w:val="nil"/>
-          <w:bottom w:val="nil"/>
-          <w:right w:val="nil"/>
-          <w:between w:val="nil"/>
-        </w:pBdr>
-        <w:spacing w:after="0"/>
-        <w:ind w:left="426" w:hanging="283"/>
-        <w:rPr>
-          <w:i/>
-          <w:color w:val="0000FF"/>
-        </w:rPr>
-      </w:pPr>
-      <w:r>
-        <w:rPr>
-          <w:i/>
-          <w:color w:val="0000FF"/>
-        </w:rPr>
-        <w:t>What will the actor use the system for?</w:t>
-      </w:r>
-    </w:p>
-    <w:p>
-      <w:pPr>
-        <w:numPr>
-          <w:ilvl w:val="0"/>
-          <w:numId w:val="6"/>
-        </w:numPr>
-        <w:pBdr>
-          <w:top w:val="nil"/>
-          <w:left w:val="nil"/>
-          <w:bottom w:val="nil"/>
-          <w:right w:val="nil"/>
-          <w:between w:val="nil"/>
-        </w:pBdr>
-        <w:spacing w:after="0"/>
-        <w:ind w:left="426" w:hanging="283"/>
-        <w:rPr>
-          <w:i/>
-          <w:color w:val="0000FF"/>
-        </w:rPr>
-      </w:pPr>
-      <w:r>
-        <w:rPr>
-          <w:i/>
-          <w:color w:val="0000FF"/>
-        </w:rPr>
-        <w:t>Will the actor create, store, change, remove, or read data in the system?</w:t>
-      </w:r>
-    </w:p>
-    <w:p>
-      <w:pPr>
-        <w:numPr>
-          <w:ilvl w:val="0"/>
-          <w:numId w:val="6"/>
-        </w:numPr>
-        <w:pBdr>
-          <w:top w:val="nil"/>
-          <w:left w:val="nil"/>
-          <w:bottom w:val="nil"/>
-          <w:right w:val="nil"/>
-          <w:between w:val="nil"/>
-        </w:pBdr>
-        <w:spacing w:after="0"/>
-        <w:ind w:left="426" w:hanging="283"/>
-        <w:rPr>
-          <w:i/>
-          <w:color w:val="0000FF"/>
-        </w:rPr>
-      </w:pPr>
-      <w:r>
-        <w:rPr>
-          <w:i/>
-          <w:color w:val="0000FF"/>
-        </w:rPr>
-        <w:t>Will the actor need to inform the system about external events or changes?</w:t>
-      </w:r>
-    </w:p>
-    <w:p>
-      <w:pPr>
-        <w:numPr>
-          <w:ilvl w:val="0"/>
-          <w:numId w:val="6"/>
-        </w:numPr>
-        <w:pBdr>
-          <w:top w:val="nil"/>
-          <w:left w:val="nil"/>
-          <w:bottom w:val="nil"/>
-          <w:right w:val="nil"/>
-          <w:between w:val="nil"/>
-        </w:pBdr>
-        <w:ind w:left="426" w:hanging="283"/>
-        <w:rPr>
-          <w:i/>
-          <w:color w:val="0000FF"/>
-        </w:rPr>
-      </w:pPr>
-      <w:r>
-        <w:rPr>
-          <w:i/>
-          <w:color w:val="0000FF"/>
-        </w:rPr>
-        <w:t>Will the actor need to be informed about certain occurrences in the system?</w:t>
-      </w:r>
-    </w:p>
-    <w:p>
-      <w:pPr>
-        <w:jc w:val="both"/>
-        <w:rPr>
-          <w:i/>
-          <w:color w:val="0000FF"/>
-        </w:rPr>
-      </w:pPr>
-      <w:r>
-        <w:rPr>
-          <w:i/>
-          <w:color w:val="0000FF"/>
-        </w:rPr>
-        <w:t>This part describe</w:t>
-      </w:r>
-      <w:r>
-        <w:rPr>
-          <w:i/>
-          <w:color w:val="0000FF"/>
-        </w:rPr>
-        <w:t>s</w:t>
-      </w:r>
-      <w:r>
-        <w:rPr>
-          <w:i/>
-          <w:color w:val="0000FF"/>
-        </w:rPr>
-        <w:t xml:space="preserve"> the use cases</w:t>
-      </w:r>
-      <w:r>
-        <w:rPr>
-          <w:i/>
-          <w:color w:val="0000FF"/>
-        </w:rPr>
-        <w:t xml:space="preserve"> you could define</w:t>
-      </w:r>
-      <w:r>
-        <w:rPr>
-          <w:i/>
-          <w:color w:val="0000FF"/>
-        </w:rPr>
-        <w:t>, you can follow the table form as below</w:t>
-      </w:r>
-      <w:r>
-        <w:rPr>
-          <w:i/>
-          <w:color w:val="0000FF"/>
-        </w:rPr>
-        <w:t>]</w:t>
-      </w:r>
-    </w:p>
-    <w:tbl>
-      <w:tblPr>
-        <w:tblW w:w="9214" w:type="dxa"/>
-        <w:tblInd w:w="-5" w:type="dxa"/>
-        <w:tblLook w:val="04A0" w:firstRow="1" w:lastRow="0" w:firstColumn="1" w:lastColumn="0" w:noHBand="0" w:noVBand="1"/>
-      </w:tblPr>
-      <w:tblGrid>
-        <w:gridCol w:w="520"/>
-        <w:gridCol w:w="1890"/>
-        <w:gridCol w:w="1701"/>
-        <w:gridCol w:w="5103"/>
-      </w:tblGrid>
-      <w:tr>
-        <w:trPr>
-          <w:trHeight w:val="288"/>
-        </w:trPr>
-        <w:tc>
-          <w:tcPr>
-            <w:tcW w:w="520" w:type="dxa"/>
-            <w:tcBorders>
-              <w:top w:val="single" w:sz="4" w:space="0" w:color="auto"/>
-              <w:left w:val="single" w:sz="4" w:space="0" w:color="auto"/>
-              <w:bottom w:val="single" w:sz="4" w:space="0" w:color="auto"/>
-              <w:right w:val="single" w:sz="4" w:space="0" w:color="auto"/>
-            </w:tcBorders>
-            <w:shd w:val="clear" w:color="auto" w:fill="FFE8E1"/>
-          </w:tcPr>
-          <w:p>
-            <w:pPr>
-              <w:spacing w:after="0" w:line="240" w:lineRule="auto"/>
-              <w:jc w:val="center"/>
-              <w:rPr>
-                <w:rFonts w:cstheme="minorHAnsi"/>
-                <w:b/>
-              </w:rPr>
-            </w:pPr>
-            <w:r>
-              <w:rPr>
-                <w:rFonts w:cstheme="minorHAnsi"/>
-                <w:b/>
-              </w:rPr>
-              <w:t>ID</w:t>
-            </w:r>
-          </w:p>
-        </w:tc>
-        <w:tc>
-          <w:tcPr>
-            <w:tcW w:w="1890" w:type="dxa"/>
-            <w:tcBorders>
-              <w:top w:val="single" w:sz="4" w:space="0" w:color="auto"/>
-              <w:left w:val="nil"/>
-              <w:bottom w:val="single" w:sz="4" w:space="0" w:color="auto"/>
-              <w:right w:val="single" w:sz="4" w:space="0" w:color="auto"/>
-            </w:tcBorders>
-            <w:shd w:val="clear" w:color="auto" w:fill="FFE8E1"/>
-            <w:noWrap/>
-            <w:vAlign w:val="bottom"/>
-            <w:hideMark/>
-          </w:tcPr>
-          <w:p>
-            <w:pPr>
-              <w:spacing w:after="0" w:line="240" w:lineRule="auto"/>
-              <w:rPr>
-                <w:rFonts w:cstheme="minorHAnsi"/>
-                <w:b/>
-              </w:rPr>
-            </w:pPr>
-            <w:r>
-              <w:rPr>
-                <w:rFonts w:cstheme="minorHAnsi"/>
-                <w:b/>
-              </w:rPr>
-              <w:t>Use Case</w:t>
-            </w:r>
-          </w:p>
-        </w:tc>
-        <w:tc>
-          <w:tcPr>
-            <w:tcW w:w="1701" w:type="dxa"/>
-            <w:tcBorders>
-              <w:top w:val="single" w:sz="4" w:space="0" w:color="auto"/>
-              <w:left w:val="nil"/>
-              <w:bottom w:val="single" w:sz="4" w:space="0" w:color="auto"/>
-              <w:right w:val="single" w:sz="4" w:space="0" w:color="auto"/>
-            </w:tcBorders>
-            <w:shd w:val="clear" w:color="auto" w:fill="FFE8E1"/>
-            <w:noWrap/>
-            <w:vAlign w:val="bottom"/>
-            <w:hideMark/>
-          </w:tcPr>
-          <w:p>
-            <w:pPr>
-              <w:spacing w:after="0" w:line="240" w:lineRule="auto"/>
-              <w:rPr>
-                <w:rFonts w:cstheme="minorHAnsi"/>
-                <w:b/>
-              </w:rPr>
-            </w:pPr>
-            <w:r>
-              <w:rPr>
-                <w:rFonts w:cstheme="minorHAnsi"/>
-                <w:b/>
-              </w:rPr>
-              <w:t>Feature</w:t>
-            </w:r>
-          </w:p>
-        </w:tc>
-        <w:tc>
-          <w:tcPr>
-            <w:tcW w:w="5103" w:type="dxa"/>
-            <w:tcBorders>
-              <w:top w:val="single" w:sz="4" w:space="0" w:color="auto"/>
-              <w:left w:val="nil"/>
-              <w:bottom w:val="single" w:sz="4" w:space="0" w:color="auto"/>
-              <w:right w:val="single" w:sz="4" w:space="0" w:color="auto"/>
-            </w:tcBorders>
-            <w:shd w:val="clear" w:color="auto" w:fill="FFE8E1"/>
-          </w:tcPr>
-          <w:p>
-            <w:pPr>
-              <w:spacing w:after="0" w:line="240" w:lineRule="auto"/>
-              <w:rPr>
-                <w:rFonts w:cstheme="minorHAnsi"/>
-                <w:b/>
-              </w:rPr>
-            </w:pPr>
-            <w:r>
-              <w:rPr>
-                <w:rFonts w:cstheme="minorHAnsi"/>
-                <w:b/>
-              </w:rPr>
-              <w:t>Use Case Description</w:t>
-            </w:r>
-          </w:p>
-        </w:tc>
-      </w:tr>
-      <w:tr>
-        <w:trPr>
-          <w:trHeight w:val="288"/>
-        </w:trPr>
-        <w:tc>
-          <w:tcPr>
-            <w:tcW w:w="520" w:type="dxa"/>
-            <w:tcBorders>
-              <w:top w:val="nil"/>
-              <w:left w:val="single" w:sz="4" w:space="0" w:color="auto"/>
-              <w:bottom w:val="single" w:sz="4" w:space="0" w:color="auto"/>
-              <w:right w:val="single" w:sz="4" w:space="0" w:color="auto"/>
-            </w:tcBorders>
-          </w:tcPr>
-          <w:p>
-            <w:pPr>
-              <w:spacing w:after="0" w:line="240" w:lineRule="auto"/>
-              <w:jc w:val="center"/>
-              <w:rPr>
-                <w:rFonts w:eastAsia="Times New Roman" w:cstheme="minorHAnsi"/>
-                <w:color w:val="000000"/>
-                <w:lang w:val="en-US"/>
-              </w:rPr>
-            </w:pPr>
-            <w:r>
-              <w:rPr>
-                <w:rFonts w:eastAsia="Times New Roman" w:cstheme="minorHAnsi"/>
-                <w:color w:val="000000"/>
-                <w:lang w:val="en-US"/>
-              </w:rPr>
-              <w:t>01</w:t>
-            </w:r>
-          </w:p>
-        </w:tc>
-        <w:tc>
-          <w:tcPr>
-            <w:tcW w:w="1890" w:type="dxa"/>
-            <w:tcBorders>
-              <w:top w:val="nil"/>
-              <w:left w:val="nil"/>
-              <w:bottom w:val="single" w:sz="4" w:space="0" w:color="auto"/>
-              <w:right w:val="single" w:sz="4" w:space="0" w:color="auto"/>
-            </w:tcBorders>
-            <w:shd w:val="clear" w:color="auto" w:fill="auto"/>
-            <w:noWrap/>
-          </w:tcPr>
-          <w:p>
-            <w:pPr>
-              <w:spacing w:after="0" w:line="240" w:lineRule="auto"/>
-            </w:pPr>
-            <w:r>
-              <w:t>View Menu</w:t>
-            </w:r>
-          </w:p>
-        </w:tc>
-        <w:tc>
-          <w:tcPr>
-            <w:tcW w:w="1701" w:type="dxa"/>
-            <w:tcBorders>
-              <w:top w:val="nil"/>
-              <w:left w:val="nil"/>
-              <w:bottom w:val="single" w:sz="4" w:space="0" w:color="auto"/>
-              <w:right w:val="single" w:sz="4" w:space="0" w:color="auto"/>
-            </w:tcBorders>
-            <w:shd w:val="clear" w:color="auto" w:fill="auto"/>
-            <w:noWrap/>
-          </w:tcPr>
-          <w:p>
-            <w:pPr>
-              <w:spacing w:after="0" w:line="240" w:lineRule="auto"/>
-              <w:rPr>
-                <w:rFonts w:eastAsia="Times New Roman" w:cstheme="minorHAnsi"/>
-                <w:color w:val="000000"/>
-                <w:lang w:val="en-US"/>
-              </w:rPr>
-            </w:pPr>
-            <w:r>
-              <w:rPr>
-                <w:rFonts w:eastAsia="Times New Roman" w:cstheme="minorHAnsi"/>
-                <w:color w:val="000000"/>
-                <w:lang w:val="en-US"/>
-              </w:rPr>
-              <w:t>Feature Name1</w:t>
-            </w:r>
-          </w:p>
-        </w:tc>
-        <w:tc>
-          <w:tcPr>
-            <w:tcW w:w="5103" w:type="dxa"/>
-            <w:tcBorders>
-              <w:top w:val="nil"/>
-              <w:left w:val="nil"/>
-              <w:bottom w:val="single" w:sz="4" w:space="0" w:color="auto"/>
-              <w:right w:val="single" w:sz="4" w:space="0" w:color="auto"/>
-            </w:tcBorders>
-          </w:tcPr>
-          <w:p>
-            <w:pPr>
-              <w:spacing w:after="0" w:line="240" w:lineRule="auto"/>
-              <w:rPr>
-                <w:rFonts w:eastAsia="Times New Roman" w:cstheme="minorHAnsi"/>
-                <w:color w:val="000000"/>
-                <w:lang w:val="en-US"/>
-              </w:rPr>
-            </w:pPr>
-          </w:p>
-        </w:tc>
-      </w:tr>
-      <w:tr>
-        <w:trPr>
-          <w:trHeight w:val="288"/>
-        </w:trPr>
-        <w:tc>
-          <w:tcPr>
-            <w:tcW w:w="520" w:type="dxa"/>
-            <w:tcBorders>
-              <w:top w:val="nil"/>
-              <w:left w:val="single" w:sz="4" w:space="0" w:color="auto"/>
-              <w:bottom w:val="single" w:sz="4" w:space="0" w:color="auto"/>
-              <w:right w:val="single" w:sz="4" w:space="0" w:color="auto"/>
-            </w:tcBorders>
-          </w:tcPr>
-          <w:p>
-            <w:pPr>
-              <w:spacing w:after="0" w:line="240" w:lineRule="auto"/>
-              <w:jc w:val="center"/>
-              <w:rPr>
-                <w:rFonts w:eastAsia="Times New Roman" w:cstheme="minorHAnsi"/>
-                <w:color w:val="000000"/>
-                <w:lang w:val="en-US"/>
-              </w:rPr>
-            </w:pPr>
-            <w:r>
-              <w:rPr>
-                <w:rFonts w:eastAsia="Times New Roman" w:cstheme="minorHAnsi"/>
-                <w:color w:val="000000"/>
-                <w:lang w:val="en-US"/>
-              </w:rPr>
-              <w:t>02</w:t>
-            </w:r>
-          </w:p>
-        </w:tc>
-        <w:tc>
-          <w:tcPr>
-            <w:tcW w:w="1890" w:type="dxa"/>
-            <w:tcBorders>
-              <w:top w:val="nil"/>
-              <w:left w:val="nil"/>
-              <w:bottom w:val="single" w:sz="4" w:space="0" w:color="auto"/>
-              <w:right w:val="single" w:sz="4" w:space="0" w:color="auto"/>
-            </w:tcBorders>
-            <w:shd w:val="clear" w:color="auto" w:fill="auto"/>
-            <w:noWrap/>
-            <w:hideMark/>
-          </w:tcPr>
-          <w:p>
-            <w:pPr>
-              <w:spacing w:after="0" w:line="240" w:lineRule="auto"/>
-              <w:rPr>
-                <w:rFonts w:eastAsia="Times New Roman" w:cstheme="minorHAnsi"/>
-                <w:color w:val="000000"/>
-                <w:lang w:val="en-US"/>
-              </w:rPr>
-            </w:pPr>
-            <w:r>
-              <w:rPr>
-                <w:rFonts w:eastAsia="Times New Roman" w:cstheme="minorHAnsi"/>
-                <w:lang w:val="en-US"/>
-              </w:rPr>
-              <w:t>Order a Meal</w:t>
-            </w:r>
-          </w:p>
-        </w:tc>
-        <w:tc>
-          <w:tcPr>
-            <w:tcW w:w="1701" w:type="dxa"/>
-            <w:tcBorders>
-              <w:top w:val="nil"/>
-              <w:left w:val="nil"/>
-              <w:bottom w:val="single" w:sz="4" w:space="0" w:color="auto"/>
-              <w:right w:val="single" w:sz="4" w:space="0" w:color="auto"/>
-            </w:tcBorders>
-            <w:shd w:val="clear" w:color="auto" w:fill="auto"/>
-            <w:noWrap/>
-            <w:hideMark/>
-          </w:tcPr>
-          <w:p>
-            <w:pPr>
-              <w:spacing w:after="0" w:line="240" w:lineRule="auto"/>
-              <w:rPr>
-                <w:rFonts w:eastAsia="Times New Roman" w:cstheme="minorHAnsi"/>
-                <w:color w:val="000000"/>
-                <w:lang w:val="en-US"/>
-              </w:rPr>
-            </w:pPr>
-            <w:r>
-              <w:rPr>
-                <w:rFonts w:eastAsia="Times New Roman" w:cstheme="minorHAnsi"/>
-                <w:color w:val="000000"/>
-                <w:lang w:val="en-US"/>
-              </w:rPr>
-              <w:t>Feature Name2</w:t>
-            </w:r>
-          </w:p>
-        </w:tc>
-        <w:tc>
-          <w:tcPr>
-            <w:tcW w:w="5103" w:type="dxa"/>
-            <w:tcBorders>
-              <w:top w:val="nil"/>
-              <w:left w:val="nil"/>
-              <w:bottom w:val="single" w:sz="4" w:space="0" w:color="auto"/>
-              <w:right w:val="single" w:sz="4" w:space="0" w:color="auto"/>
-            </w:tcBorders>
-          </w:tcPr>
-          <w:p>
-            <w:pPr>
-              <w:spacing w:after="0" w:line="240" w:lineRule="auto"/>
-              <w:rPr>
-                <w:rFonts w:eastAsia="Times New Roman" w:cstheme="minorHAnsi"/>
-                <w:color w:val="000000"/>
-                <w:lang w:val="en-US"/>
-              </w:rPr>
-            </w:pPr>
-          </w:p>
-        </w:tc>
-      </w:tr>
-      <w:tr>
-        <w:trPr>
-          <w:trHeight w:val="288"/>
-        </w:trPr>
-        <w:tc>
-          <w:tcPr>
-            <w:tcW w:w="520" w:type="dxa"/>
-            <w:tcBorders>
-              <w:top w:val="single" w:sz="4" w:space="0" w:color="auto"/>
-              <w:left w:val="single" w:sz="4" w:space="0" w:color="auto"/>
-              <w:bottom w:val="single" w:sz="4" w:space="0" w:color="auto"/>
-              <w:right w:val="single" w:sz="4" w:space="0" w:color="auto"/>
-            </w:tcBorders>
-          </w:tcPr>
-          <w:p>
-            <w:pPr>
-              <w:spacing w:after="0" w:line="240" w:lineRule="auto"/>
-              <w:jc w:val="center"/>
-              <w:rPr>
-                <w:rFonts w:eastAsia="Times New Roman" w:cstheme="minorHAnsi"/>
-                <w:color w:val="000000"/>
-                <w:lang w:val="en-US"/>
-              </w:rPr>
-            </w:pPr>
-            <w:r>
-              <w:rPr>
-                <w:rFonts w:eastAsia="Times New Roman" w:cstheme="minorHAnsi"/>
-                <w:color w:val="000000"/>
-                <w:lang w:val="en-US"/>
-              </w:rPr>
-              <w:t>03</w:t>
-            </w:r>
-          </w:p>
-        </w:tc>
-        <w:tc>
-          <w:tcPr>
-            <w:tcW w:w="1890" w:type="dxa"/>
-            <w:tcBorders>
-              <w:top w:val="single" w:sz="4" w:space="0" w:color="auto"/>
-              <w:left w:val="nil"/>
-              <w:bottom w:val="single" w:sz="4" w:space="0" w:color="auto"/>
-              <w:right w:val="single" w:sz="4" w:space="0" w:color="auto"/>
-            </w:tcBorders>
-            <w:shd w:val="clear" w:color="auto" w:fill="auto"/>
-            <w:noWrap/>
-          </w:tcPr>
-          <w:p>
-            <w:pPr>
-              <w:spacing w:after="0" w:line="240" w:lineRule="auto"/>
-              <w:rPr>
-                <w:rFonts w:eastAsia="Times New Roman" w:cstheme="minorHAnsi"/>
-                <w:lang w:val="en-US"/>
-              </w:rPr>
-            </w:pPr>
-            <w:r>
-              <w:rPr>
-                <w:rFonts w:eastAsia="Times New Roman" w:cstheme="minorHAnsi"/>
-                <w:lang w:val="en-US"/>
-              </w:rPr>
-              <w:t>…</w:t>
-            </w:r>
-          </w:p>
-        </w:tc>
-        <w:tc>
-          <w:tcPr>
-            <w:tcW w:w="1701" w:type="dxa"/>
-            <w:tcBorders>
-              <w:top w:val="single" w:sz="4" w:space="0" w:color="auto"/>
-              <w:left w:val="nil"/>
-              <w:bottom w:val="single" w:sz="4" w:space="0" w:color="auto"/>
-              <w:right w:val="single" w:sz="4" w:space="0" w:color="auto"/>
-            </w:tcBorders>
-            <w:shd w:val="clear" w:color="auto" w:fill="auto"/>
-            <w:noWrap/>
-          </w:tcPr>
-          <w:p>
-            <w:pPr>
-              <w:spacing w:after="0" w:line="240" w:lineRule="auto"/>
-              <w:rPr>
-                <w:rFonts w:eastAsia="Times New Roman" w:cstheme="minorHAnsi"/>
-                <w:color w:val="000000"/>
-                <w:lang w:val="en-US"/>
-              </w:rPr>
-            </w:pPr>
-          </w:p>
-        </w:tc>
-        <w:tc>
-          <w:tcPr>
-            <w:tcW w:w="5103" w:type="dxa"/>
-            <w:tcBorders>
-              <w:top w:val="single" w:sz="4" w:space="0" w:color="auto"/>
-              <w:left w:val="nil"/>
-              <w:bottom w:val="single" w:sz="4" w:space="0" w:color="auto"/>
-              <w:right w:val="single" w:sz="4" w:space="0" w:color="auto"/>
-            </w:tcBorders>
-          </w:tcPr>
-          <w:p>
-            <w:pPr>
-              <w:spacing w:after="0" w:line="240" w:lineRule="auto"/>
-              <w:rPr>
-                <w:rFonts w:eastAsia="Times New Roman" w:cstheme="minorHAnsi"/>
-                <w:color w:val="000000"/>
-                <w:lang w:val="en-US"/>
-              </w:rPr>
-            </w:pPr>
-          </w:p>
-        </w:tc>
-      </w:tr>
-    </w:tbl>
-    <w:p>
-      <w:r>
-        <w:t>…</w:t>
-      </w:r>
-    </w:p>
-    <w:p>
-      <w:pPr>
-        <w:pStyle w:val="Heading4"/>
-      </w:pPr>
-      <w:r>
-        <w:t>1.</w:t>
-      </w:r>
-      <w:r>
-        <w:t>3</w:t>
-      </w:r>
-      <w:r>
-        <w:t xml:space="preserve">.2 </w:t>
-      </w:r>
-      <w:r>
-        <w:t xml:space="preserve">Use Case </w:t>
-      </w:r>
-      <w:r>
-        <w:t>Diagrams</w:t>
-      </w:r>
-    </w:p>
-    <w:p>
-      <w:pPr>
-        <w:jc w:val="both"/>
-        <w:rPr>
-          <w:i/>
-          <w:color w:val="0000FF"/>
-        </w:rPr>
-      </w:pPr>
-      <w:r>
-        <w:rPr>
-          <w:i/>
-          <w:color w:val="0000FF"/>
-        </w:rPr>
-        <w:t>In this section, you need to provide the UC diagram(s) to show the actor-UCs and UC-UC relationships like the sample below. You can have multiple UC diagrams for the system, each diagram is for one actor or one workflow]</w:t>
-      </w:r>
-    </w:p>
-    <w:p>
-      <w:pPr>
-        <w:pStyle w:val="Heading5"/>
-      </w:pPr>
-      <w:r>
-        <w:t>1.</w:t>
-      </w:r>
-      <w:r>
-        <w:t>3</w:t>
-      </w:r>
-      <w:r>
-        <w:t>.2.1 UCs for Guest</w:t>
-      </w:r>
-    </w:p>
-    <w:p>
-      <w:pPr>
-        <w:jc w:val="center"/>
-        <w:rPr>
-          <w:i/>
-        </w:rPr>
-      </w:pPr>
-      <w:r>
-        <w:rPr>
-          <w:i/>
-          <w:noProof/>
-        </w:rPr>
         <w:drawing>
-          <wp:inline distT="0" distB="0" distL="0" distR="0" wp14:anchorId="4EFE15D5" wp14:editId="04985DD4">
-            <wp:extent cx="3384468" cy="1597231"/>
-            <wp:effectExtent l="0" t="0" r="6985" b="3175"/>
-            <wp:docPr id="27" name="image7.png"/>
-            <wp:cNvGraphicFramePr/>
+          <wp:inline distT="0" distB="0" distL="0" distR="0" wp14:anchorId="3C53133A" wp14:editId="41163B9D">
+            <wp:extent cx="5746750" cy="2850515"/>
+            <wp:effectExtent l="0" t="0" r="6350" b="6985"/>
+            <wp:docPr id="73396872" name="Picture 1"/>
+            <wp:cNvGraphicFramePr>
+              <a:graphicFrameLocks xmlns:a="http://schemas.openxmlformats.org/drawingml/2006/main" noChangeAspect="1"/>
+            </wp:cNvGraphicFramePr>
             <a:graphic xmlns:a="http://schemas.openxmlformats.org/drawingml/2006/main">
               <a:graphicData uri="http://schemas.openxmlformats.org/drawingml/2006/picture">
                 <pic:pic xmlns:pic="http://schemas.openxmlformats.org/drawingml/2006/picture">
                   <pic:nvPicPr>
-                    <pic:cNvPr id="0" name="image7.png"/>
-                    <pic:cNvPicPr preferRelativeResize="0"/>
+                    <pic:cNvPr id="73396872" name=""/>
+                    <pic:cNvPicPr/>
                   </pic:nvPicPr>
                   <pic:blipFill>
                     <a:blip r:embed="rId11"/>
-                    <a:srcRect/>
                     <a:stretch>
                       <a:fillRect/>
                     </a:stretch>
@@ -4757,12 +3483,11 @@
                   <pic:spPr>
                     <a:xfrm>
                       <a:off x="0" y="0"/>
-                      <a:ext cx="3430984" cy="1619183"/>
+                      <a:ext cx="5746750" cy="2850515"/>
                     </a:xfrm>
                     <a:prstGeom prst="rect">
                       <a:avLst/>
                     </a:prstGeom>
-                    <a:ln/>
                   </pic:spPr>
                 </pic:pic>
               </a:graphicData>
@@ -4771,49 +3496,46 @@
         </w:drawing>
       </w:r>
     </w:p>
-    <w:p/>
     <w:p>
       <w:pPr>
-        <w:pStyle w:val="Heading5"/>
-      </w:pPr>
-      <w:r>
-        <w:t>1.</w:t>
-      </w:r>
-      <w:r>
-        <w:t>3</w:t>
-      </w:r>
-      <w:r>
-        <w:t>.2.2 UCs for Student</w:t>
+        <w:pStyle w:val="Heading4"/>
+        <w:rPr>
+          <w:lang w:val="en-US"/>
+        </w:rPr>
+      </w:pPr>
+      <w:r>
+        <w:lastRenderedPageBreak/>
+        <w:t xml:space="preserve">1.2.3 </w:t>
+      </w:r>
+      <w:r>
+        <w:rPr>
+          <w:lang w:val="vi-VN"/>
+        </w:rPr>
+        <w:t>Streamlined 1-Click Checkout</w:t>
       </w:r>
     </w:p>
     <w:p>
-      <w:pPr>
-        <w:jc w:val="center"/>
+      <w:r>
         <w:rPr>
-          <w:i/>
-        </w:rPr>
-      </w:pPr>
-      <w:r>
-        <w:rPr>
-          <w:i/>
           <w:noProof/>
         </w:rPr>
         <w:drawing>
-          <wp:inline distT="0" distB="0" distL="0" distR="0" wp14:anchorId="64545280" wp14:editId="11EDD317">
-            <wp:extent cx="3253839" cy="1692233"/>
-            <wp:effectExtent l="0" t="0" r="3810" b="3810"/>
-            <wp:docPr id="30" name="image9.png"/>
-            <wp:cNvGraphicFramePr/>
+          <wp:inline distT="0" distB="0" distL="0" distR="0" wp14:anchorId="2EBFB5A3" wp14:editId="4F734E0C">
+            <wp:extent cx="5746750" cy="2032635"/>
+            <wp:effectExtent l="0" t="0" r="6350" b="5715"/>
+            <wp:docPr id="1483667848" name="Picture 1"/>
+            <wp:cNvGraphicFramePr>
+              <a:graphicFrameLocks xmlns:a="http://schemas.openxmlformats.org/drawingml/2006/main" noChangeAspect="1"/>
+            </wp:cNvGraphicFramePr>
             <a:graphic xmlns:a="http://schemas.openxmlformats.org/drawingml/2006/main">
               <a:graphicData uri="http://schemas.openxmlformats.org/drawingml/2006/picture">
                 <pic:pic xmlns:pic="http://schemas.openxmlformats.org/drawingml/2006/picture">
                   <pic:nvPicPr>
-                    <pic:cNvPr id="0" name="image9.png"/>
-                    <pic:cNvPicPr preferRelativeResize="0"/>
+                    <pic:cNvPr id="1483667848" name=""/>
+                    <pic:cNvPicPr/>
                   </pic:nvPicPr>
                   <pic:blipFill>
                     <a:blip r:embed="rId12"/>
-                    <a:srcRect/>
                     <a:stretch>
                       <a:fillRect/>
                     </a:stretch>
@@ -4821,12 +3543,11 @@
                   <pic:spPr>
                     <a:xfrm>
                       <a:off x="0" y="0"/>
-                      <a:ext cx="3273805" cy="1702617"/>
+                      <a:ext cx="5746750" cy="2032635"/>
                     </a:xfrm>
                     <a:prstGeom prst="rect">
                       <a:avLst/>
                     </a:prstGeom>
-                    <a:ln/>
                   </pic:spPr>
                 </pic:pic>
               </a:graphicData>
@@ -4837,8 +3558,9 @@
     </w:p>
     <w:p>
       <w:pPr>
-        <w:pStyle w:val="Heading5"/>
-      </w:pPr>
+        <w:pStyle w:val="Heading3"/>
+      </w:pPr>
+      <w:bookmarkStart w:id="5" w:name="_Toc187341935"/>
       <w:r>
         <w:t>1.</w:t>
       </w:r>
@@ -4846,20 +3568,17 @@
         <w:t>3</w:t>
       </w:r>
       <w:r>
-        <w:t>.2.3 …</w:t>
-      </w:r>
+        <w:t xml:space="preserve"> User Requirements</w:t>
+      </w:r>
+      <w:bookmarkEnd w:id="5"/>
     </w:p>
-    <w:p/>
     <w:p>
       <w:pPr>
-        <w:pStyle w:val="Heading3"/>
-      </w:pPr>
-      <w:bookmarkStart w:id="6" w:name="_Toc187341936"/>
-      <w:r>
-        <w:lastRenderedPageBreak/>
-        <w:t>1.4 System Functionalities</w:t>
-      </w:r>
-      <w:bookmarkEnd w:id="6"/>
+        <w:pStyle w:val="Heading4"/>
+      </w:pPr>
+      <w:r>
+        <w:t>1.3.1 Actors</w:t>
+      </w:r>
     </w:p>
     <w:p>
       <w:pPr>
@@ -4869,36 +3588,2000 @@
           <w:color w:val="0000FF"/>
         </w:rPr>
       </w:pPr>
-      <w:r>
+    </w:p>
+    <w:tbl>
+      <w:tblPr>
+        <w:tblStyle w:val="TableGrid"/>
+        <w:tblW w:w="9071" w:type="dxa"/>
+        <w:tblLayout w:type="fixed"/>
+        <w:tblLook w:val="04A0" w:firstRow="1" w:lastRow="0" w:firstColumn="1" w:lastColumn="0" w:noHBand="0" w:noVBand="1"/>
+      </w:tblPr>
+      <w:tblGrid>
+        <w:gridCol w:w="567"/>
+        <w:gridCol w:w="2551"/>
+        <w:gridCol w:w="5953"/>
+      </w:tblGrid>
+      <w:tr>
+        <w:tc>
+          <w:tcPr>
+            <w:tcW w:w="567" w:type="dxa"/>
+            <w:shd w:val="clear" w:color="auto" w:fill="FFE8E1"/>
+            <w:tcMar>
+              <w:top w:w="50" w:type="dxa"/>
+              <w:left w:w="108" w:type="dxa"/>
+              <w:bottom w:w="50" w:type="dxa"/>
+              <w:right w:w="108" w:type="dxa"/>
+            </w:tcMar>
+          </w:tcPr>
+          <w:p>
+            <w:pPr>
+              <w:spacing w:before="20" w:after="20"/>
+              <w:jc w:val="center"/>
+            </w:pPr>
+            <w:r>
+              <w:rPr>
+                <w:b/>
+              </w:rPr>
+              <w:t>#</w:t>
+            </w:r>
+          </w:p>
+        </w:tc>
+        <w:tc>
+          <w:tcPr>
+            <w:tcW w:w="2551" w:type="dxa"/>
+            <w:shd w:val="clear" w:color="auto" w:fill="FFE8E1"/>
+            <w:tcMar>
+              <w:top w:w="50" w:type="dxa"/>
+              <w:left w:w="108" w:type="dxa"/>
+              <w:bottom w:w="50" w:type="dxa"/>
+              <w:right w:w="108" w:type="dxa"/>
+            </w:tcMar>
+          </w:tcPr>
+          <w:p>
+            <w:pPr>
+              <w:spacing w:before="20" w:after="20"/>
+              <w:jc w:val="center"/>
+            </w:pPr>
+            <w:r>
+              <w:rPr>
+                <w:b/>
+              </w:rPr>
+              <w:t>Actor</w:t>
+            </w:r>
+          </w:p>
+        </w:tc>
+        <w:tc>
+          <w:tcPr>
+            <w:tcW w:w="5953" w:type="dxa"/>
+            <w:shd w:val="clear" w:color="auto" w:fill="FFE8E1"/>
+            <w:tcMar>
+              <w:top w:w="50" w:type="dxa"/>
+              <w:left w:w="108" w:type="dxa"/>
+              <w:bottom w:w="50" w:type="dxa"/>
+              <w:right w:w="108" w:type="dxa"/>
+            </w:tcMar>
+          </w:tcPr>
+          <w:p>
+            <w:pPr>
+              <w:spacing w:before="20" w:after="20"/>
+              <w:jc w:val="center"/>
+            </w:pPr>
+            <w:r>
+              <w:rPr>
+                <w:b/>
+              </w:rPr>
+              <w:t>Description</w:t>
+            </w:r>
+          </w:p>
+        </w:tc>
+      </w:tr>
+      <w:tr>
+        <w:tc>
+          <w:tcPr>
+            <w:tcW w:w="567" w:type="dxa"/>
+            <w:shd w:val="clear" w:color="auto" w:fill="FFFFFF"/>
+            <w:tcMar>
+              <w:top w:w="50" w:type="dxa"/>
+              <w:left w:w="108" w:type="dxa"/>
+              <w:bottom w:w="50" w:type="dxa"/>
+              <w:right w:w="108" w:type="dxa"/>
+            </w:tcMar>
+          </w:tcPr>
+          <w:p>
+            <w:pPr>
+              <w:spacing w:before="20" w:after="20"/>
+              <w:jc w:val="center"/>
+            </w:pPr>
+            <w:r>
+              <w:t>1</w:t>
+            </w:r>
+          </w:p>
+        </w:tc>
+        <w:tc>
+          <w:tcPr>
+            <w:tcW w:w="2551" w:type="dxa"/>
+            <w:shd w:val="clear" w:color="auto" w:fill="FFFFFF"/>
+            <w:tcMar>
+              <w:top w:w="50" w:type="dxa"/>
+              <w:left w:w="108" w:type="dxa"/>
+              <w:bottom w:w="50" w:type="dxa"/>
+              <w:right w:w="108" w:type="dxa"/>
+            </w:tcMar>
+          </w:tcPr>
+          <w:p>
+            <w:r>
+              <w:rPr>
+                <w:b/>
+              </w:rPr>
+              <w:t>Parents</w:t>
+            </w:r>
+            <w:r>
+              <w:rPr>
+                <w:b/>
+              </w:rPr>
+              <w:br/>
+              <w:t>(Phụ huynh)</w:t>
+            </w:r>
+            <w:r>
+              <w:br/>
+            </w:r>
+            <w:r>
+              <w:rPr>
+                <w:i/>
+                <w:color w:val="555555"/>
+                <w:sz w:val="18"/>
+              </w:rPr>
+              <w:t>Human | External User</w:t>
+            </w:r>
+          </w:p>
+        </w:tc>
+        <w:tc>
+          <w:tcPr>
+            <w:tcW w:w="5953" w:type="dxa"/>
+            <w:shd w:val="clear" w:color="auto" w:fill="FFFFFF"/>
+            <w:tcMar>
+              <w:top w:w="50" w:type="dxa"/>
+              <w:left w:w="108" w:type="dxa"/>
+              <w:bottom w:w="50" w:type="dxa"/>
+              <w:right w:w="108" w:type="dxa"/>
+            </w:tcMar>
+          </w:tcPr>
+          <w:p>
+            <w:pPr>
+              <w:spacing w:before="20" w:after="20"/>
+            </w:pPr>
+            <w:r>
+              <w:t>Parents or guardians of pediatric patients who interact with HCMS via the self-service Booking Portal (smartphone/web). They initiate appointment bookings, provide child's Patient Demographics, receive appointment confirmations, and view post-visit clinical notes &amp; prescriptions on their device. They are outside the clinic and do not use the internal dashboard.</w:t>
+            </w:r>
+          </w:p>
+        </w:tc>
+      </w:tr>
+      <w:tr>
+        <w:tc>
+          <w:tcPr>
+            <w:tcW w:w="567" w:type="dxa"/>
+            <w:shd w:val="clear" w:color="auto" w:fill="FFF5F3"/>
+            <w:tcMar>
+              <w:top w:w="50" w:type="dxa"/>
+              <w:left w:w="108" w:type="dxa"/>
+              <w:bottom w:w="50" w:type="dxa"/>
+              <w:right w:w="108" w:type="dxa"/>
+            </w:tcMar>
+          </w:tcPr>
+          <w:p>
+            <w:pPr>
+              <w:spacing w:before="20" w:after="20"/>
+              <w:jc w:val="center"/>
+            </w:pPr>
+            <w:r>
+              <w:t>2</w:t>
+            </w:r>
+          </w:p>
+        </w:tc>
+        <w:tc>
+          <w:tcPr>
+            <w:tcW w:w="2551" w:type="dxa"/>
+            <w:shd w:val="clear" w:color="auto" w:fill="FFF5F3"/>
+            <w:tcMar>
+              <w:top w:w="50" w:type="dxa"/>
+              <w:left w:w="108" w:type="dxa"/>
+              <w:bottom w:w="50" w:type="dxa"/>
+              <w:right w:w="108" w:type="dxa"/>
+            </w:tcMar>
+          </w:tcPr>
+          <w:p>
+            <w:r>
+              <w:rPr>
+                <w:b/>
+              </w:rPr>
+              <w:t>Doctor</w:t>
+            </w:r>
+            <w:r>
+              <w:rPr>
+                <w:b/>
+              </w:rPr>
+              <w:br/>
+              <w:t>(Bác sĩ)</w:t>
+            </w:r>
+            <w:r>
+              <w:br/>
+            </w:r>
+            <w:r>
+              <w:rPr>
+                <w:i/>
+                <w:color w:val="555555"/>
+                <w:sz w:val="18"/>
+              </w:rPr>
+              <w:t>Human | Primary Internal User &amp; System Sponsor</w:t>
+            </w:r>
+          </w:p>
+        </w:tc>
+        <w:tc>
+          <w:tcPr>
+            <w:tcW w:w="5953" w:type="dxa"/>
+            <w:shd w:val="clear" w:color="auto" w:fill="FFF5F3"/>
+            <w:tcMar>
+              <w:top w:w="50" w:type="dxa"/>
+              <w:left w:w="108" w:type="dxa"/>
+              <w:bottom w:w="50" w:type="dxa"/>
+              <w:right w:w="108" w:type="dxa"/>
+            </w:tcMar>
+          </w:tcPr>
+          <w:p>
+            <w:pPr>
+              <w:spacing w:before="20" w:after="20"/>
+            </w:pPr>
+            <w:r>
+              <w:t>The lead physician (Dr. Minh) who acts as both project sponsor and the primary clinical user. Doctors interact with HCMS to access a real-time patient queue dashboard, retrieve full Medical History (EMR) for each patient, record clinical consultation outcomes into a VISIT entity, and issue electronic Prescriptions using the autocomplete drug-name feature. All Doctor interactions are within the clinic's internal network.</w:t>
+            </w:r>
+          </w:p>
+        </w:tc>
+      </w:tr>
+      <w:tr>
+        <w:tc>
+          <w:tcPr>
+            <w:tcW w:w="567" w:type="dxa"/>
+            <w:shd w:val="clear" w:color="auto" w:fill="FFFFFF"/>
+            <w:tcMar>
+              <w:top w:w="50" w:type="dxa"/>
+              <w:left w:w="108" w:type="dxa"/>
+              <w:bottom w:w="50" w:type="dxa"/>
+              <w:right w:w="108" w:type="dxa"/>
+            </w:tcMar>
+          </w:tcPr>
+          <w:p>
+            <w:pPr>
+              <w:spacing w:before="20" w:after="20"/>
+              <w:jc w:val="center"/>
+            </w:pPr>
+            <w:r>
+              <w:t>3</w:t>
+            </w:r>
+          </w:p>
+        </w:tc>
+        <w:tc>
+          <w:tcPr>
+            <w:tcW w:w="2551" w:type="dxa"/>
+            <w:shd w:val="clear" w:color="auto" w:fill="FFFFFF"/>
+            <w:tcMar>
+              <w:top w:w="50" w:type="dxa"/>
+              <w:left w:w="108" w:type="dxa"/>
+              <w:bottom w:w="50" w:type="dxa"/>
+              <w:right w:w="108" w:type="dxa"/>
+            </w:tcMar>
+          </w:tcPr>
+          <w:p>
+            <w:r>
+              <w:rPr>
+                <w:b/>
+              </w:rPr>
+              <w:t>Receptionist</w:t>
+            </w:r>
+            <w:r>
+              <w:rPr>
+                <w:b/>
+              </w:rPr>
+              <w:br/>
+              <w:t>(Lễ tân)</w:t>
+            </w:r>
+            <w:r>
+              <w:br/>
+            </w:r>
+            <w:r>
+              <w:rPr>
+                <w:i/>
+                <w:color w:val="555555"/>
+                <w:sz w:val="18"/>
+              </w:rPr>
+              <w:t>Human | Key Internal Operator</w:t>
+            </w:r>
+          </w:p>
+        </w:tc>
+        <w:tc>
+          <w:tcPr>
+            <w:tcW w:w="5953" w:type="dxa"/>
+            <w:shd w:val="clear" w:color="auto" w:fill="FFFFFF"/>
+            <w:tcMar>
+              <w:top w:w="50" w:type="dxa"/>
+              <w:left w:w="108" w:type="dxa"/>
+              <w:bottom w:w="50" w:type="dxa"/>
+              <w:right w:w="108" w:type="dxa"/>
+            </w:tcMar>
+          </w:tcPr>
+          <w:p>
+            <w:pPr>
+              <w:spacing w:before="20" w:after="20"/>
+            </w:pPr>
+            <w:r>
+              <w:t>The front-desk operator (Chị Lan) responsible for administrative clinic operations. Receptionists interact with HCMS to view Appointment Dashboard, confirm or manually register appointments (including walk-ins), verify the auto-generated BILLING invoices, and execute the 1-Click Payment status update (Unpaid → Paid). She is a high-frequency user of the system.</w:t>
+            </w:r>
+          </w:p>
+        </w:tc>
+      </w:tr>
+    </w:tbl>
+    <w:p/>
+    <w:p>
+      <w:pPr>
+        <w:pStyle w:val="Heading4"/>
+      </w:pPr>
+      <w:r>
+        <w:t>1.3.2 Use Cases (UC)</w:t>
+      </w:r>
+    </w:p>
+    <w:tbl>
+      <w:tblPr>
+        <w:tblStyle w:val="TableGrid"/>
+        <w:tblW w:w="9071" w:type="dxa"/>
+        <w:tblLayout w:type="fixed"/>
+        <w:tblLook w:val="04A0" w:firstRow="1" w:lastRow="0" w:firstColumn="1" w:lastColumn="0" w:noHBand="0" w:noVBand="1"/>
+      </w:tblPr>
+      <w:tblGrid>
+        <w:gridCol w:w="850"/>
+        <w:gridCol w:w="2268"/>
+        <w:gridCol w:w="1984"/>
+        <w:gridCol w:w="3969"/>
+      </w:tblGrid>
+      <w:tr>
+        <w:tc>
+          <w:tcPr>
+            <w:tcW w:w="850" w:type="dxa"/>
+            <w:shd w:val="clear" w:color="auto" w:fill="FFE8E1"/>
+            <w:tcMar>
+              <w:top w:w="50" w:type="dxa"/>
+              <w:left w:w="108" w:type="dxa"/>
+              <w:bottom w:w="50" w:type="dxa"/>
+              <w:right w:w="108" w:type="dxa"/>
+            </w:tcMar>
+          </w:tcPr>
+          <w:p>
+            <w:pPr>
+              <w:spacing w:before="20" w:after="20"/>
+              <w:jc w:val="center"/>
+            </w:pPr>
+            <w:r>
+              <w:rPr>
+                <w:b/>
+              </w:rPr>
+              <w:t>ID</w:t>
+            </w:r>
+          </w:p>
+        </w:tc>
+        <w:tc>
+          <w:tcPr>
+            <w:tcW w:w="2268" w:type="dxa"/>
+            <w:shd w:val="clear" w:color="auto" w:fill="FFE8E1"/>
+            <w:tcMar>
+              <w:top w:w="50" w:type="dxa"/>
+              <w:left w:w="108" w:type="dxa"/>
+              <w:bottom w:w="50" w:type="dxa"/>
+              <w:right w:w="108" w:type="dxa"/>
+            </w:tcMar>
+          </w:tcPr>
+          <w:p>
+            <w:pPr>
+              <w:spacing w:before="20" w:after="20"/>
+              <w:jc w:val="center"/>
+            </w:pPr>
+            <w:r>
+              <w:rPr>
+                <w:b/>
+              </w:rPr>
+              <w:t>Use Case</w:t>
+            </w:r>
+          </w:p>
+        </w:tc>
+        <w:tc>
+          <w:tcPr>
+            <w:tcW w:w="1984" w:type="dxa"/>
+            <w:shd w:val="clear" w:color="auto" w:fill="FFE8E1"/>
+            <w:tcMar>
+              <w:top w:w="50" w:type="dxa"/>
+              <w:left w:w="108" w:type="dxa"/>
+              <w:bottom w:w="50" w:type="dxa"/>
+              <w:right w:w="108" w:type="dxa"/>
+            </w:tcMar>
+          </w:tcPr>
+          <w:p>
+            <w:pPr>
+              <w:spacing w:before="20" w:after="20"/>
+              <w:jc w:val="center"/>
+            </w:pPr>
+            <w:r>
+              <w:rPr>
+                <w:b/>
+              </w:rPr>
+              <w:t>Feature</w:t>
+            </w:r>
+          </w:p>
+        </w:tc>
+        <w:tc>
+          <w:tcPr>
+            <w:tcW w:w="3969" w:type="dxa"/>
+            <w:shd w:val="clear" w:color="auto" w:fill="FFE8E1"/>
+            <w:tcMar>
+              <w:top w:w="50" w:type="dxa"/>
+              <w:left w:w="108" w:type="dxa"/>
+              <w:bottom w:w="50" w:type="dxa"/>
+              <w:right w:w="108" w:type="dxa"/>
+            </w:tcMar>
+          </w:tcPr>
+          <w:p>
+            <w:pPr>
+              <w:spacing w:before="20" w:after="20"/>
+              <w:jc w:val="center"/>
+            </w:pPr>
+            <w:r>
+              <w:rPr>
+                <w:b/>
+              </w:rPr>
+              <w:t>Use Case Description</w:t>
+            </w:r>
+          </w:p>
+        </w:tc>
+      </w:tr>
+      <w:tr>
+        <w:tc>
+          <w:tcPr>
+            <w:tcW w:w="850" w:type="dxa"/>
+            <w:shd w:val="clear" w:color="auto" w:fill="FFFFFF"/>
+            <w:tcMar>
+              <w:top w:w="50" w:type="dxa"/>
+              <w:left w:w="108" w:type="dxa"/>
+              <w:bottom w:w="50" w:type="dxa"/>
+              <w:right w:w="108" w:type="dxa"/>
+            </w:tcMar>
+          </w:tcPr>
+          <w:p>
+            <w:pPr>
+              <w:spacing w:before="20" w:after="20"/>
+              <w:jc w:val="center"/>
+            </w:pPr>
+            <w:r>
+              <w:rPr>
+                <w:b/>
+              </w:rPr>
+              <w:t>UC-01</w:t>
+            </w:r>
+          </w:p>
+        </w:tc>
+        <w:tc>
+          <w:tcPr>
+            <w:tcW w:w="2268" w:type="dxa"/>
+            <w:shd w:val="clear" w:color="auto" w:fill="FFFFFF"/>
+            <w:tcMar>
+              <w:top w:w="50" w:type="dxa"/>
+              <w:left w:w="108" w:type="dxa"/>
+              <w:bottom w:w="50" w:type="dxa"/>
+              <w:right w:w="108" w:type="dxa"/>
+            </w:tcMar>
+          </w:tcPr>
+          <w:p>
+            <w:pPr>
+              <w:spacing w:before="20" w:after="20"/>
+            </w:pPr>
+            <w:r>
+              <w:rPr>
+                <w:b/>
+              </w:rPr>
+              <w:t>Book Appointment Online</w:t>
+            </w:r>
+          </w:p>
+        </w:tc>
+        <w:tc>
+          <w:tcPr>
+            <w:tcW w:w="1984" w:type="dxa"/>
+            <w:shd w:val="clear" w:color="auto" w:fill="FFFFFF"/>
+            <w:tcMar>
+              <w:top w:w="50" w:type="dxa"/>
+              <w:left w:w="108" w:type="dxa"/>
+              <w:bottom w:w="50" w:type="dxa"/>
+              <w:right w:w="108" w:type="dxa"/>
+            </w:tcMar>
+          </w:tcPr>
+          <w:p>
+            <w:pPr>
+              <w:spacing w:before="20" w:after="20"/>
+            </w:pPr>
+            <w:r>
+              <w:rPr>
+                <w:i/>
+              </w:rPr>
+              <w:t>Self-Service Booking Portal</w:t>
+            </w:r>
+          </w:p>
+        </w:tc>
+        <w:tc>
+          <w:tcPr>
+            <w:tcW w:w="3969" w:type="dxa"/>
+            <w:shd w:val="clear" w:color="auto" w:fill="FFFFFF"/>
+            <w:tcMar>
+              <w:top w:w="50" w:type="dxa"/>
+              <w:left w:w="108" w:type="dxa"/>
+              <w:bottom w:w="50" w:type="dxa"/>
+              <w:right w:w="108" w:type="dxa"/>
+            </w:tcMar>
+          </w:tcPr>
+          <w:p>
+            <w:pPr>
+              <w:spacing w:before="20" w:after="20"/>
+            </w:pPr>
+            <w:r>
+              <w:t>Parents access the online Booking Portal, select a preferred Doctor (by name/specialty) and an available time slot from the real-time calendar. The system validates the slot and auto-</w:t>
+            </w:r>
+            <w:r>
+              <w:lastRenderedPageBreak/>
+              <w:t>creates an APPOINTMENT entity with status 'Pending'. The Receptionist is notified on her dashboard of the new pending booking.</w:t>
+            </w:r>
+          </w:p>
+        </w:tc>
+      </w:tr>
+      <w:tr>
+        <w:tc>
+          <w:tcPr>
+            <w:tcW w:w="850" w:type="dxa"/>
+            <w:shd w:val="clear" w:color="auto" w:fill="FFF5F3"/>
+            <w:tcMar>
+              <w:top w:w="50" w:type="dxa"/>
+              <w:left w:w="108" w:type="dxa"/>
+              <w:bottom w:w="50" w:type="dxa"/>
+              <w:right w:w="108" w:type="dxa"/>
+            </w:tcMar>
+          </w:tcPr>
+          <w:p>
+            <w:pPr>
+              <w:spacing w:before="20" w:after="20"/>
+              <w:jc w:val="center"/>
+            </w:pPr>
+            <w:r>
+              <w:rPr>
+                <w:b/>
+              </w:rPr>
+              <w:lastRenderedPageBreak/>
+              <w:t>UC-02</w:t>
+            </w:r>
+          </w:p>
+        </w:tc>
+        <w:tc>
+          <w:tcPr>
+            <w:tcW w:w="2268" w:type="dxa"/>
+            <w:shd w:val="clear" w:color="auto" w:fill="FFF5F3"/>
+            <w:tcMar>
+              <w:top w:w="50" w:type="dxa"/>
+              <w:left w:w="108" w:type="dxa"/>
+              <w:bottom w:w="50" w:type="dxa"/>
+              <w:right w:w="108" w:type="dxa"/>
+            </w:tcMar>
+          </w:tcPr>
+          <w:p>
+            <w:pPr>
+              <w:spacing w:before="20" w:after="20"/>
+            </w:pPr>
+            <w:r>
+              <w:rPr>
+                <w:b/>
+              </w:rPr>
+              <w:t>Provide Patient Demographics</w:t>
+            </w:r>
+          </w:p>
+        </w:tc>
+        <w:tc>
+          <w:tcPr>
+            <w:tcW w:w="1984" w:type="dxa"/>
+            <w:shd w:val="clear" w:color="auto" w:fill="FFF5F3"/>
+            <w:tcMar>
+              <w:top w:w="50" w:type="dxa"/>
+              <w:left w:w="108" w:type="dxa"/>
+              <w:bottom w:w="50" w:type="dxa"/>
+              <w:right w:w="108" w:type="dxa"/>
+            </w:tcMar>
+          </w:tcPr>
+          <w:p>
+            <w:pPr>
+              <w:spacing w:before="20" w:after="20"/>
+            </w:pPr>
+            <w:r>
+              <w:rPr>
+                <w:i/>
+              </w:rPr>
+              <w:t>Self-Service Booking Portal</w:t>
+            </w:r>
+          </w:p>
+        </w:tc>
+        <w:tc>
+          <w:tcPr>
+            <w:tcW w:w="3969" w:type="dxa"/>
+            <w:shd w:val="clear" w:color="auto" w:fill="FFF5F3"/>
+            <w:tcMar>
+              <w:top w:w="50" w:type="dxa"/>
+              <w:left w:w="108" w:type="dxa"/>
+              <w:bottom w:w="50" w:type="dxa"/>
+              <w:right w:w="108" w:type="dxa"/>
+            </w:tcMar>
+          </w:tcPr>
+          <w:p>
+            <w:pPr>
+              <w:spacing w:before="20" w:after="20"/>
+            </w:pPr>
+            <w:r>
+              <w:t>During an initial booking (or at check-in), Parents input the child's personal and medical data: full name, date of birth, parent phone/email, and primary medical notes. The system creates or updates the PATIENT entity linked to the APPOINTMENT record.</w:t>
+            </w:r>
+          </w:p>
+        </w:tc>
+      </w:tr>
+      <w:tr>
+        <w:tc>
+          <w:tcPr>
+            <w:tcW w:w="850" w:type="dxa"/>
+            <w:shd w:val="clear" w:color="auto" w:fill="FFFFFF"/>
+            <w:tcMar>
+              <w:top w:w="50" w:type="dxa"/>
+              <w:left w:w="108" w:type="dxa"/>
+              <w:bottom w:w="50" w:type="dxa"/>
+              <w:right w:w="108" w:type="dxa"/>
+            </w:tcMar>
+          </w:tcPr>
+          <w:p>
+            <w:pPr>
+              <w:spacing w:before="20" w:after="20"/>
+              <w:jc w:val="center"/>
+            </w:pPr>
+            <w:r>
+              <w:rPr>
+                <w:b/>
+              </w:rPr>
+              <w:t>UC-03</w:t>
+            </w:r>
+          </w:p>
+        </w:tc>
+        <w:tc>
+          <w:tcPr>
+            <w:tcW w:w="2268" w:type="dxa"/>
+            <w:shd w:val="clear" w:color="auto" w:fill="FFFFFF"/>
+            <w:tcMar>
+              <w:top w:w="50" w:type="dxa"/>
+              <w:left w:w="108" w:type="dxa"/>
+              <w:bottom w:w="50" w:type="dxa"/>
+              <w:right w:w="108" w:type="dxa"/>
+            </w:tcMar>
+          </w:tcPr>
+          <w:p>
+            <w:pPr>
+              <w:spacing w:before="20" w:after="20"/>
+            </w:pPr>
+            <w:r>
+              <w:rPr>
+                <w:b/>
+              </w:rPr>
+              <w:t>Receive Appointment Confirmation</w:t>
+            </w:r>
+          </w:p>
+        </w:tc>
+        <w:tc>
+          <w:tcPr>
+            <w:tcW w:w="1984" w:type="dxa"/>
+            <w:shd w:val="clear" w:color="auto" w:fill="FFFFFF"/>
+            <w:tcMar>
+              <w:top w:w="50" w:type="dxa"/>
+              <w:left w:w="108" w:type="dxa"/>
+              <w:bottom w:w="50" w:type="dxa"/>
+              <w:right w:w="108" w:type="dxa"/>
+            </w:tcMar>
+          </w:tcPr>
+          <w:p>
+            <w:pPr>
+              <w:spacing w:before="20" w:after="20"/>
+            </w:pPr>
+            <w:r>
+              <w:rPr>
+                <w:i/>
+              </w:rPr>
+              <w:t>Appointment Notification</w:t>
+            </w:r>
+          </w:p>
+        </w:tc>
+        <w:tc>
+          <w:tcPr>
+            <w:tcW w:w="3969" w:type="dxa"/>
+            <w:shd w:val="clear" w:color="auto" w:fill="FFFFFF"/>
+            <w:tcMar>
+              <w:top w:w="50" w:type="dxa"/>
+              <w:left w:w="108" w:type="dxa"/>
+              <w:bottom w:w="50" w:type="dxa"/>
+              <w:right w:w="108" w:type="dxa"/>
+            </w:tcMar>
+          </w:tcPr>
+          <w:p>
+            <w:pPr>
+              <w:spacing w:before="20" w:after="20"/>
+            </w:pPr>
+            <w:r>
+              <w:t>After the Receptionist confirms a pending appointment, HCMS automatically sends an Appointment Confirmation notification (SMS/Email) to the Parent's registered contact, including appointment date, time, doctor name, and clinic address.</w:t>
+            </w:r>
+          </w:p>
+        </w:tc>
+      </w:tr>
+      <w:tr>
+        <w:tc>
+          <w:tcPr>
+            <w:tcW w:w="850" w:type="dxa"/>
+            <w:shd w:val="clear" w:color="auto" w:fill="FFF5F3"/>
+            <w:tcMar>
+              <w:top w:w="50" w:type="dxa"/>
+              <w:left w:w="108" w:type="dxa"/>
+              <w:bottom w:w="50" w:type="dxa"/>
+              <w:right w:w="108" w:type="dxa"/>
+            </w:tcMar>
+          </w:tcPr>
+          <w:p>
+            <w:pPr>
+              <w:spacing w:before="20" w:after="20"/>
+              <w:jc w:val="center"/>
+            </w:pPr>
+            <w:r>
+              <w:rPr>
+                <w:b/>
+              </w:rPr>
+              <w:t>UC-04</w:t>
+            </w:r>
+          </w:p>
+        </w:tc>
+        <w:tc>
+          <w:tcPr>
+            <w:tcW w:w="2268" w:type="dxa"/>
+            <w:shd w:val="clear" w:color="auto" w:fill="FFF5F3"/>
+            <w:tcMar>
+              <w:top w:w="50" w:type="dxa"/>
+              <w:left w:w="108" w:type="dxa"/>
+              <w:bottom w:w="50" w:type="dxa"/>
+              <w:right w:w="108" w:type="dxa"/>
+            </w:tcMar>
+          </w:tcPr>
+          <w:p>
+            <w:pPr>
+              <w:spacing w:before="20" w:after="20"/>
+            </w:pPr>
+            <w:r>
+              <w:rPr>
+                <w:b/>
+              </w:rPr>
+              <w:t>View Clinical Notes &amp; Prescriptions</w:t>
+            </w:r>
+          </w:p>
+        </w:tc>
+        <w:tc>
+          <w:tcPr>
+            <w:tcW w:w="1984" w:type="dxa"/>
+            <w:shd w:val="clear" w:color="auto" w:fill="FFF5F3"/>
+            <w:tcMar>
+              <w:top w:w="50" w:type="dxa"/>
+              <w:left w:w="108" w:type="dxa"/>
+              <w:bottom w:w="50" w:type="dxa"/>
+              <w:right w:w="108" w:type="dxa"/>
+            </w:tcMar>
+          </w:tcPr>
+          <w:p>
+            <w:pPr>
+              <w:spacing w:before="20" w:after="20"/>
+            </w:pPr>
+            <w:r>
+              <w:rPr>
+                <w:i/>
+              </w:rPr>
+              <w:t>Patient EMR Portal</w:t>
+            </w:r>
+          </w:p>
+        </w:tc>
+        <w:tc>
+          <w:tcPr>
+            <w:tcW w:w="3969" w:type="dxa"/>
+            <w:shd w:val="clear" w:color="auto" w:fill="FFF5F3"/>
+            <w:tcMar>
+              <w:top w:w="50" w:type="dxa"/>
+              <w:left w:w="108" w:type="dxa"/>
+              <w:bottom w:w="50" w:type="dxa"/>
+              <w:right w:w="108" w:type="dxa"/>
+            </w:tcMar>
+          </w:tcPr>
+          <w:p>
+            <w:pPr>
+              <w:spacing w:before="20" w:after="20"/>
+            </w:pPr>
+            <w:r>
+              <w:t>After a completed visit, Parents can log in to the portal to review the Doctor's clinical notes (VISIT record: diagnosis, symptoms, aftercare instructions) and the linked electronic PRESCRIPTION (medicine name, dosage, frequency, duration) on their smartphone.</w:t>
+            </w:r>
+          </w:p>
+        </w:tc>
+      </w:tr>
+      <w:tr>
+        <w:tc>
+          <w:tcPr>
+            <w:tcW w:w="850" w:type="dxa"/>
+            <w:shd w:val="clear" w:color="auto" w:fill="FFF0F5"/>
+            <w:tcMar>
+              <w:top w:w="50" w:type="dxa"/>
+              <w:left w:w="108" w:type="dxa"/>
+              <w:bottom w:w="50" w:type="dxa"/>
+              <w:right w:w="108" w:type="dxa"/>
+            </w:tcMar>
+          </w:tcPr>
+          <w:p>
+            <w:pPr>
+              <w:spacing w:before="20" w:after="20"/>
+              <w:jc w:val="center"/>
+            </w:pPr>
+            <w:r>
+              <w:rPr>
+                <w:b/>
+              </w:rPr>
+              <w:t>UC-05</w:t>
+            </w:r>
+          </w:p>
+        </w:tc>
+        <w:tc>
+          <w:tcPr>
+            <w:tcW w:w="2268" w:type="dxa"/>
+            <w:shd w:val="clear" w:color="auto" w:fill="FFF0F5"/>
+            <w:tcMar>
+              <w:top w:w="50" w:type="dxa"/>
+              <w:left w:w="108" w:type="dxa"/>
+              <w:bottom w:w="50" w:type="dxa"/>
+              <w:right w:w="108" w:type="dxa"/>
+            </w:tcMar>
+          </w:tcPr>
+          <w:p>
+            <w:pPr>
+              <w:spacing w:before="20" w:after="20"/>
+            </w:pPr>
+            <w:r>
+              <w:rPr>
+                <w:b/>
+              </w:rPr>
+              <w:t>View Appointment Dashboard</w:t>
+            </w:r>
+          </w:p>
+        </w:tc>
+        <w:tc>
+          <w:tcPr>
+            <w:tcW w:w="1984" w:type="dxa"/>
+            <w:shd w:val="clear" w:color="auto" w:fill="FFF0F5"/>
+            <w:tcMar>
+              <w:top w:w="50" w:type="dxa"/>
+              <w:left w:w="108" w:type="dxa"/>
+              <w:bottom w:w="50" w:type="dxa"/>
+              <w:right w:w="108" w:type="dxa"/>
+            </w:tcMar>
+          </w:tcPr>
+          <w:p>
+            <w:pPr>
+              <w:spacing w:before="20" w:after="20"/>
+            </w:pPr>
+            <w:r>
+              <w:rPr>
+                <w:i/>
+              </w:rPr>
+              <w:t>Appointment Management</w:t>
+            </w:r>
+          </w:p>
+        </w:tc>
+        <w:tc>
+          <w:tcPr>
+            <w:tcW w:w="3969" w:type="dxa"/>
+            <w:shd w:val="clear" w:color="auto" w:fill="FFF0F5"/>
+            <w:tcMar>
+              <w:top w:w="50" w:type="dxa"/>
+              <w:left w:w="108" w:type="dxa"/>
+              <w:bottom w:w="50" w:type="dxa"/>
+              <w:right w:w="108" w:type="dxa"/>
+            </w:tcMar>
+          </w:tcPr>
+          <w:p>
+            <w:pPr>
+              <w:spacing w:before="20" w:after="20"/>
+            </w:pPr>
+            <w:r>
+              <w:t>The Receptionist views a live, sortable dashboard listing all upcoming appointments for the day: patient name, time slot, assigned Doctor, and current APPOINTMENT status (Pending / Confirmed / In-Progress / Completed). The dashboard auto-refreshes in real time.</w:t>
+            </w:r>
+          </w:p>
+        </w:tc>
+      </w:tr>
+      <w:tr>
+        <w:tc>
+          <w:tcPr>
+            <w:tcW w:w="850" w:type="dxa"/>
+            <w:shd w:val="clear" w:color="auto" w:fill="FFEBEE"/>
+            <w:tcMar>
+              <w:top w:w="50" w:type="dxa"/>
+              <w:left w:w="108" w:type="dxa"/>
+              <w:bottom w:w="50" w:type="dxa"/>
+              <w:right w:w="108" w:type="dxa"/>
+            </w:tcMar>
+          </w:tcPr>
+          <w:p>
+            <w:pPr>
+              <w:spacing w:before="20" w:after="20"/>
+              <w:jc w:val="center"/>
+            </w:pPr>
+            <w:r>
+              <w:rPr>
+                <w:b/>
+              </w:rPr>
+              <w:t>UC-06</w:t>
+            </w:r>
+          </w:p>
+        </w:tc>
+        <w:tc>
+          <w:tcPr>
+            <w:tcW w:w="2268" w:type="dxa"/>
+            <w:shd w:val="clear" w:color="auto" w:fill="FFEBEE"/>
+            <w:tcMar>
+              <w:top w:w="50" w:type="dxa"/>
+              <w:left w:w="108" w:type="dxa"/>
+              <w:bottom w:w="50" w:type="dxa"/>
+              <w:right w:w="108" w:type="dxa"/>
+            </w:tcMar>
+          </w:tcPr>
+          <w:p>
+            <w:pPr>
+              <w:spacing w:before="20" w:after="20"/>
+            </w:pPr>
+            <w:r>
+              <w:rPr>
+                <w:b/>
+              </w:rPr>
+              <w:t>Confirm Appointment</w:t>
+            </w:r>
+          </w:p>
+        </w:tc>
+        <w:tc>
+          <w:tcPr>
+            <w:tcW w:w="1984" w:type="dxa"/>
+            <w:shd w:val="clear" w:color="auto" w:fill="FFEBEE"/>
+            <w:tcMar>
+              <w:top w:w="50" w:type="dxa"/>
+              <w:left w:w="108" w:type="dxa"/>
+              <w:bottom w:w="50" w:type="dxa"/>
+              <w:right w:w="108" w:type="dxa"/>
+            </w:tcMar>
+          </w:tcPr>
+          <w:p>
+            <w:pPr>
+              <w:spacing w:before="20" w:after="20"/>
+            </w:pPr>
+            <w:r>
+              <w:rPr>
+                <w:i/>
+              </w:rPr>
+              <w:t>Appointment Management</w:t>
+            </w:r>
+          </w:p>
+        </w:tc>
+        <w:tc>
+          <w:tcPr>
+            <w:tcW w:w="3969" w:type="dxa"/>
+            <w:shd w:val="clear" w:color="auto" w:fill="FFEBEE"/>
+            <w:tcMar>
+              <w:top w:w="50" w:type="dxa"/>
+              <w:left w:w="108" w:type="dxa"/>
+              <w:bottom w:w="50" w:type="dxa"/>
+              <w:right w:w="108" w:type="dxa"/>
+            </w:tcMar>
+          </w:tcPr>
+          <w:p>
+            <w:pPr>
+              <w:spacing w:before="20" w:after="20"/>
+            </w:pPr>
+            <w:r>
+              <w:t>Upon reviewing a Parent-submitted Pending appointment, the Receptionist validates the information and clicks 'Confirm'. The system updates the APPOINTMENT status from 'Pending' to 'Confirmed' and triggers the confirmation notification to the Parent (see UC-03).</w:t>
+            </w:r>
+          </w:p>
+        </w:tc>
+      </w:tr>
+      <w:tr>
+        <w:tc>
+          <w:tcPr>
+            <w:tcW w:w="850" w:type="dxa"/>
+            <w:shd w:val="clear" w:color="auto" w:fill="FFF0F5"/>
+            <w:tcMar>
+              <w:top w:w="50" w:type="dxa"/>
+              <w:left w:w="108" w:type="dxa"/>
+              <w:bottom w:w="50" w:type="dxa"/>
+              <w:right w:w="108" w:type="dxa"/>
+            </w:tcMar>
+          </w:tcPr>
+          <w:p>
+            <w:pPr>
+              <w:spacing w:before="20" w:after="20"/>
+              <w:jc w:val="center"/>
+            </w:pPr>
+            <w:r>
+              <w:rPr>
+                <w:b/>
+              </w:rPr>
+              <w:t>UC-07</w:t>
+            </w:r>
+          </w:p>
+        </w:tc>
+        <w:tc>
+          <w:tcPr>
+            <w:tcW w:w="2268" w:type="dxa"/>
+            <w:shd w:val="clear" w:color="auto" w:fill="FFF0F5"/>
+            <w:tcMar>
+              <w:top w:w="50" w:type="dxa"/>
+              <w:left w:w="108" w:type="dxa"/>
+              <w:bottom w:w="50" w:type="dxa"/>
+              <w:right w:w="108" w:type="dxa"/>
+            </w:tcMar>
+          </w:tcPr>
+          <w:p>
+            <w:pPr>
+              <w:spacing w:before="20" w:after="20"/>
+            </w:pPr>
+            <w:r>
+              <w:rPr>
+                <w:b/>
+              </w:rPr>
+              <w:t>Register Walk-in Appointment</w:t>
+            </w:r>
+          </w:p>
+        </w:tc>
+        <w:tc>
+          <w:tcPr>
+            <w:tcW w:w="1984" w:type="dxa"/>
+            <w:shd w:val="clear" w:color="auto" w:fill="FFF0F5"/>
+            <w:tcMar>
+              <w:top w:w="50" w:type="dxa"/>
+              <w:left w:w="108" w:type="dxa"/>
+              <w:bottom w:w="50" w:type="dxa"/>
+              <w:right w:w="108" w:type="dxa"/>
+            </w:tcMar>
+          </w:tcPr>
+          <w:p>
+            <w:pPr>
+              <w:spacing w:before="20" w:after="20"/>
+            </w:pPr>
+            <w:r>
+              <w:rPr>
+                <w:i/>
+              </w:rPr>
+              <w:t>Appointment Management</w:t>
+            </w:r>
+          </w:p>
+        </w:tc>
+        <w:tc>
+          <w:tcPr>
+            <w:tcW w:w="3969" w:type="dxa"/>
+            <w:shd w:val="clear" w:color="auto" w:fill="FFF0F5"/>
+            <w:tcMar>
+              <w:top w:w="50" w:type="dxa"/>
+              <w:left w:w="108" w:type="dxa"/>
+              <w:bottom w:w="50" w:type="dxa"/>
+              <w:right w:w="108" w:type="dxa"/>
+            </w:tcMar>
+          </w:tcPr>
+          <w:p>
+            <w:pPr>
+              <w:spacing w:before="20" w:after="20"/>
+            </w:pPr>
+            <w:r>
+              <w:t xml:space="preserve">For patients who arrive at the clinic without a prior online booking, the Receptionist manually creates a new APPOINTMENT record by entering the patient info and selecting an available Doctor and time slot. The walk-in </w:t>
+            </w:r>
+            <w:r>
+              <w:lastRenderedPageBreak/>
+              <w:t>APPOINTMENT is created with status 'Confirmed'.</w:t>
+            </w:r>
+          </w:p>
+        </w:tc>
+      </w:tr>
+      <w:tr>
+        <w:tc>
+          <w:tcPr>
+            <w:tcW w:w="850" w:type="dxa"/>
+            <w:shd w:val="clear" w:color="auto" w:fill="FFEBEE"/>
+            <w:tcMar>
+              <w:top w:w="50" w:type="dxa"/>
+              <w:left w:w="108" w:type="dxa"/>
+              <w:bottom w:w="50" w:type="dxa"/>
+              <w:right w:w="108" w:type="dxa"/>
+            </w:tcMar>
+          </w:tcPr>
+          <w:p>
+            <w:pPr>
+              <w:spacing w:before="20" w:after="20"/>
+              <w:jc w:val="center"/>
+            </w:pPr>
+            <w:r>
+              <w:rPr>
+                <w:b/>
+              </w:rPr>
+              <w:lastRenderedPageBreak/>
+              <w:t>UC-08</w:t>
+            </w:r>
+          </w:p>
+        </w:tc>
+        <w:tc>
+          <w:tcPr>
+            <w:tcW w:w="2268" w:type="dxa"/>
+            <w:shd w:val="clear" w:color="auto" w:fill="FFEBEE"/>
+            <w:tcMar>
+              <w:top w:w="50" w:type="dxa"/>
+              <w:left w:w="108" w:type="dxa"/>
+              <w:bottom w:w="50" w:type="dxa"/>
+              <w:right w:w="108" w:type="dxa"/>
+            </w:tcMar>
+          </w:tcPr>
+          <w:p>
+            <w:pPr>
+              <w:spacing w:before="20" w:after="20"/>
+            </w:pPr>
+            <w:r>
+              <w:rPr>
+                <w:b/>
+              </w:rPr>
+              <w:t>View Billing Invoice</w:t>
+            </w:r>
+          </w:p>
+        </w:tc>
+        <w:tc>
+          <w:tcPr>
+            <w:tcW w:w="1984" w:type="dxa"/>
+            <w:shd w:val="clear" w:color="auto" w:fill="FFEBEE"/>
+            <w:tcMar>
+              <w:top w:w="50" w:type="dxa"/>
+              <w:left w:w="108" w:type="dxa"/>
+              <w:bottom w:w="50" w:type="dxa"/>
+              <w:right w:w="108" w:type="dxa"/>
+            </w:tcMar>
+          </w:tcPr>
+          <w:p>
+            <w:pPr>
+              <w:spacing w:before="20" w:after="20"/>
+            </w:pPr>
+            <w:r>
+              <w:rPr>
+                <w:i/>
+              </w:rPr>
+              <w:t>Billing &amp; Payment</w:t>
+            </w:r>
+          </w:p>
+        </w:tc>
+        <w:tc>
+          <w:tcPr>
+            <w:tcW w:w="3969" w:type="dxa"/>
+            <w:shd w:val="clear" w:color="auto" w:fill="FFEBEE"/>
+            <w:tcMar>
+              <w:top w:w="50" w:type="dxa"/>
+              <w:left w:w="108" w:type="dxa"/>
+              <w:bottom w:w="50" w:type="dxa"/>
+              <w:right w:w="108" w:type="dxa"/>
+            </w:tcMar>
+          </w:tcPr>
+          <w:p>
+            <w:pPr>
+              <w:spacing w:before="20" w:after="20"/>
+            </w:pPr>
+            <w:r>
+              <w:t>Once the Doctor completes and saves a VISIT + PRESCRIPTION record, the HCMS system automatically generates a BILLING invoice summarizing: consultation fee, itemized prescription costs, and total amount due. The Receptionist can view this invoice on the dashboard with status 'Unpaid'.</w:t>
+            </w:r>
+          </w:p>
+        </w:tc>
+      </w:tr>
+      <w:tr>
+        <w:tc>
+          <w:tcPr>
+            <w:tcW w:w="850" w:type="dxa"/>
+            <w:shd w:val="clear" w:color="auto" w:fill="FFF0F5"/>
+            <w:tcMar>
+              <w:top w:w="50" w:type="dxa"/>
+              <w:left w:w="108" w:type="dxa"/>
+              <w:bottom w:w="50" w:type="dxa"/>
+              <w:right w:w="108" w:type="dxa"/>
+            </w:tcMar>
+          </w:tcPr>
+          <w:p>
+            <w:pPr>
+              <w:spacing w:before="20" w:after="20"/>
+              <w:jc w:val="center"/>
+            </w:pPr>
+            <w:r>
+              <w:rPr>
+                <w:b/>
+              </w:rPr>
+              <w:t>UC-09</w:t>
+            </w:r>
+          </w:p>
+        </w:tc>
+        <w:tc>
+          <w:tcPr>
+            <w:tcW w:w="2268" w:type="dxa"/>
+            <w:shd w:val="clear" w:color="auto" w:fill="FFF0F5"/>
+            <w:tcMar>
+              <w:top w:w="50" w:type="dxa"/>
+              <w:left w:w="108" w:type="dxa"/>
+              <w:bottom w:w="50" w:type="dxa"/>
+              <w:right w:w="108" w:type="dxa"/>
+            </w:tcMar>
+          </w:tcPr>
+          <w:p>
+            <w:pPr>
+              <w:spacing w:before="20" w:after="20"/>
+            </w:pPr>
+            <w:r>
+              <w:rPr>
+                <w:b/>
+              </w:rPr>
+              <w:t>Update Payment Status (1-Click Paid)</w:t>
+            </w:r>
+          </w:p>
+        </w:tc>
+        <w:tc>
+          <w:tcPr>
+            <w:tcW w:w="1984" w:type="dxa"/>
+            <w:shd w:val="clear" w:color="auto" w:fill="FFF0F5"/>
+            <w:tcMar>
+              <w:top w:w="50" w:type="dxa"/>
+              <w:left w:w="108" w:type="dxa"/>
+              <w:bottom w:w="50" w:type="dxa"/>
+              <w:right w:w="108" w:type="dxa"/>
+            </w:tcMar>
+          </w:tcPr>
+          <w:p>
+            <w:pPr>
+              <w:spacing w:before="20" w:after="20"/>
+            </w:pPr>
+            <w:r>
+              <w:rPr>
+                <w:i/>
+              </w:rPr>
+              <w:t>Billing &amp; Payment</w:t>
+            </w:r>
+          </w:p>
+        </w:tc>
+        <w:tc>
+          <w:tcPr>
+            <w:tcW w:w="3969" w:type="dxa"/>
+            <w:shd w:val="clear" w:color="auto" w:fill="FFF0F5"/>
+            <w:tcMar>
+              <w:top w:w="50" w:type="dxa"/>
+              <w:left w:w="108" w:type="dxa"/>
+              <w:bottom w:w="50" w:type="dxa"/>
+              <w:right w:w="108" w:type="dxa"/>
+            </w:tcMar>
+          </w:tcPr>
+          <w:p>
+            <w:pPr>
+              <w:spacing w:before="20" w:after="20"/>
+            </w:pPr>
+            <w:r>
+              <w:t>After collecting the payment from the Parent (cash or bank transfer at the counter), the Receptionist clicks a single 'Mark as Paid' button. The system instantly updates the BILLING status from 'Unpaid' to 'Paid', records the payment timestamp, and logs the transaction for the end-of-day revenue reconciliation report.</w:t>
+            </w:r>
+          </w:p>
+        </w:tc>
+      </w:tr>
+      <w:tr>
+        <w:tc>
+          <w:tcPr>
+            <w:tcW w:w="850" w:type="dxa"/>
+            <w:shd w:val="clear" w:color="auto" w:fill="EBFFEB"/>
+            <w:tcMar>
+              <w:top w:w="50" w:type="dxa"/>
+              <w:left w:w="108" w:type="dxa"/>
+              <w:bottom w:w="50" w:type="dxa"/>
+              <w:right w:w="108" w:type="dxa"/>
+            </w:tcMar>
+          </w:tcPr>
+          <w:p>
+            <w:pPr>
+              <w:spacing w:before="20" w:after="20"/>
+              <w:jc w:val="center"/>
+            </w:pPr>
+            <w:r>
+              <w:rPr>
+                <w:b/>
+              </w:rPr>
+              <w:t>UC-10</w:t>
+            </w:r>
+          </w:p>
+        </w:tc>
+        <w:tc>
+          <w:tcPr>
+            <w:tcW w:w="2268" w:type="dxa"/>
+            <w:shd w:val="clear" w:color="auto" w:fill="EBFFEB"/>
+            <w:tcMar>
+              <w:top w:w="50" w:type="dxa"/>
+              <w:left w:w="108" w:type="dxa"/>
+              <w:bottom w:w="50" w:type="dxa"/>
+              <w:right w:w="108" w:type="dxa"/>
+            </w:tcMar>
+          </w:tcPr>
+          <w:p>
+            <w:pPr>
+              <w:spacing w:before="20" w:after="20"/>
+            </w:pPr>
+            <w:r>
+              <w:rPr>
+                <w:b/>
+              </w:rPr>
+              <w:t>View Patient Queue</w:t>
+            </w:r>
+          </w:p>
+        </w:tc>
+        <w:tc>
+          <w:tcPr>
+            <w:tcW w:w="1984" w:type="dxa"/>
+            <w:shd w:val="clear" w:color="auto" w:fill="EBFFEB"/>
+            <w:tcMar>
+              <w:top w:w="50" w:type="dxa"/>
+              <w:left w:w="108" w:type="dxa"/>
+              <w:bottom w:w="50" w:type="dxa"/>
+              <w:right w:w="108" w:type="dxa"/>
+            </w:tcMar>
+          </w:tcPr>
+          <w:p>
+            <w:pPr>
+              <w:spacing w:before="20" w:after="20"/>
+            </w:pPr>
+            <w:r>
+              <w:rPr>
+                <w:i/>
+              </w:rPr>
+              <w:t>Clinical Dashboard</w:t>
+            </w:r>
+          </w:p>
+        </w:tc>
+        <w:tc>
+          <w:tcPr>
+            <w:tcW w:w="3969" w:type="dxa"/>
+            <w:shd w:val="clear" w:color="auto" w:fill="EBFFEB"/>
+            <w:tcMar>
+              <w:top w:w="50" w:type="dxa"/>
+              <w:left w:w="108" w:type="dxa"/>
+              <w:bottom w:w="50" w:type="dxa"/>
+              <w:right w:w="108" w:type="dxa"/>
+            </w:tcMar>
+          </w:tcPr>
+          <w:p>
+            <w:pPr>
+              <w:spacing w:before="20" w:after="20"/>
+            </w:pPr>
+            <w:r>
+              <w:t>The Doctor opens their personal clinical dashboard to see the ordered list of patients waiting for examination: patient name, appointment time, and current status. The queue is auto-sorted by appointment time and updated in real time as Receptionists confirm arrivals.</w:t>
+            </w:r>
+          </w:p>
+        </w:tc>
+      </w:tr>
+      <w:tr>
+        <w:tc>
+          <w:tcPr>
+            <w:tcW w:w="850" w:type="dxa"/>
+            <w:shd w:val="clear" w:color="auto" w:fill="F3FFF3"/>
+            <w:tcMar>
+              <w:top w:w="50" w:type="dxa"/>
+              <w:left w:w="108" w:type="dxa"/>
+              <w:bottom w:w="50" w:type="dxa"/>
+              <w:right w:w="108" w:type="dxa"/>
+            </w:tcMar>
+          </w:tcPr>
+          <w:p>
+            <w:pPr>
+              <w:spacing w:before="20" w:after="20"/>
+              <w:jc w:val="center"/>
+            </w:pPr>
+            <w:r>
+              <w:rPr>
+                <w:b/>
+              </w:rPr>
+              <w:t>UC-11</w:t>
+            </w:r>
+          </w:p>
+        </w:tc>
+        <w:tc>
+          <w:tcPr>
+            <w:tcW w:w="2268" w:type="dxa"/>
+            <w:shd w:val="clear" w:color="auto" w:fill="F3FFF3"/>
+            <w:tcMar>
+              <w:top w:w="50" w:type="dxa"/>
+              <w:left w:w="108" w:type="dxa"/>
+              <w:bottom w:w="50" w:type="dxa"/>
+              <w:right w:w="108" w:type="dxa"/>
+            </w:tcMar>
+          </w:tcPr>
+          <w:p>
+            <w:pPr>
+              <w:spacing w:before="20" w:after="20"/>
+            </w:pPr>
+            <w:r>
+              <w:rPr>
+                <w:b/>
+              </w:rPr>
+              <w:t>Access Patient Medical History (EMR)</w:t>
+            </w:r>
+          </w:p>
+        </w:tc>
+        <w:tc>
+          <w:tcPr>
+            <w:tcW w:w="1984" w:type="dxa"/>
+            <w:shd w:val="clear" w:color="auto" w:fill="F3FFF3"/>
+            <w:tcMar>
+              <w:top w:w="50" w:type="dxa"/>
+              <w:left w:w="108" w:type="dxa"/>
+              <w:bottom w:w="50" w:type="dxa"/>
+              <w:right w:w="108" w:type="dxa"/>
+            </w:tcMar>
+          </w:tcPr>
+          <w:p>
+            <w:pPr>
+              <w:spacing w:before="20" w:after="20"/>
+            </w:pPr>
+            <w:r>
+              <w:rPr>
+                <w:i/>
+              </w:rPr>
+              <w:t>EMR – Medical History</w:t>
+            </w:r>
+          </w:p>
+        </w:tc>
+        <w:tc>
+          <w:tcPr>
+            <w:tcW w:w="3969" w:type="dxa"/>
+            <w:shd w:val="clear" w:color="auto" w:fill="F3FFF3"/>
+            <w:tcMar>
+              <w:top w:w="50" w:type="dxa"/>
+              <w:left w:w="108" w:type="dxa"/>
+              <w:bottom w:w="50" w:type="dxa"/>
+              <w:right w:w="108" w:type="dxa"/>
+            </w:tcMar>
+          </w:tcPr>
+          <w:p>
+            <w:pPr>
+              <w:spacing w:before="20" w:after="20"/>
+            </w:pPr>
+            <w:r>
+              <w:t>Before or during an examination, the Doctor selects a patient from the queue and retrieves their complete Electronic Medical Record: full PATIENT profile, all previous VISIT records (past diagnoses, symptoms), and all past PRESCRIPTION records. This enables evidence-based, data-driven clinical decisions without paper records.</w:t>
+            </w:r>
+          </w:p>
+        </w:tc>
+      </w:tr>
+      <w:tr>
+        <w:tc>
+          <w:tcPr>
+            <w:tcW w:w="850" w:type="dxa"/>
+            <w:shd w:val="clear" w:color="auto" w:fill="EBFFEB"/>
+            <w:tcMar>
+              <w:top w:w="50" w:type="dxa"/>
+              <w:left w:w="108" w:type="dxa"/>
+              <w:bottom w:w="50" w:type="dxa"/>
+              <w:right w:w="108" w:type="dxa"/>
+            </w:tcMar>
+          </w:tcPr>
+          <w:p>
+            <w:pPr>
+              <w:spacing w:before="20" w:after="20"/>
+              <w:jc w:val="center"/>
+            </w:pPr>
+            <w:r>
+              <w:rPr>
+                <w:b/>
+              </w:rPr>
+              <w:t>UC-12</w:t>
+            </w:r>
+          </w:p>
+        </w:tc>
+        <w:tc>
+          <w:tcPr>
+            <w:tcW w:w="2268" w:type="dxa"/>
+            <w:shd w:val="clear" w:color="auto" w:fill="EBFFEB"/>
+            <w:tcMar>
+              <w:top w:w="50" w:type="dxa"/>
+              <w:left w:w="108" w:type="dxa"/>
+              <w:bottom w:w="50" w:type="dxa"/>
+              <w:right w:w="108" w:type="dxa"/>
+            </w:tcMar>
+          </w:tcPr>
+          <w:p>
+            <w:pPr>
+              <w:spacing w:before="20" w:after="20"/>
+            </w:pPr>
+            <w:r>
+              <w:rPr>
+                <w:b/>
+              </w:rPr>
+              <w:t>Record Clinical Consultation (VISIT)</w:t>
+            </w:r>
+          </w:p>
+        </w:tc>
+        <w:tc>
+          <w:tcPr>
+            <w:tcW w:w="1984" w:type="dxa"/>
+            <w:shd w:val="clear" w:color="auto" w:fill="EBFFEB"/>
+            <w:tcMar>
+              <w:top w:w="50" w:type="dxa"/>
+              <w:left w:w="108" w:type="dxa"/>
+              <w:bottom w:w="50" w:type="dxa"/>
+              <w:right w:w="108" w:type="dxa"/>
+            </w:tcMar>
+          </w:tcPr>
+          <w:p>
+            <w:pPr>
+              <w:spacing w:before="20" w:after="20"/>
+            </w:pPr>
+            <w:r>
+              <w:rPr>
+                <w:i/>
+              </w:rPr>
+              <w:t>EMR – Visit Management</w:t>
+            </w:r>
+          </w:p>
+        </w:tc>
+        <w:tc>
+          <w:tcPr>
+            <w:tcW w:w="3969" w:type="dxa"/>
+            <w:shd w:val="clear" w:color="auto" w:fill="EBFFEB"/>
+            <w:tcMar>
+              <w:top w:w="50" w:type="dxa"/>
+              <w:left w:w="108" w:type="dxa"/>
+              <w:bottom w:w="50" w:type="dxa"/>
+              <w:right w:w="108" w:type="dxa"/>
+            </w:tcMar>
+          </w:tcPr>
+          <w:p>
+            <w:pPr>
+              <w:spacing w:before="20" w:after="20"/>
+            </w:pPr>
+            <w:r>
+              <w:t>During the physical examination, the Doctor enters the consultation outcome into a new VISIT record: observed symptoms, clinical diagnosis (ICD-coded), physical examination notes, and aftercare/follow-up instructions. The VISIT record is saved and linked to the patient's PATIENT entity and the originating APPOINTMENT.</w:t>
+            </w:r>
+          </w:p>
+        </w:tc>
+      </w:tr>
+      <w:tr>
+        <w:tc>
+          <w:tcPr>
+            <w:tcW w:w="850" w:type="dxa"/>
+            <w:shd w:val="clear" w:color="auto" w:fill="F3FFF3"/>
+            <w:tcMar>
+              <w:top w:w="50" w:type="dxa"/>
+              <w:left w:w="108" w:type="dxa"/>
+              <w:bottom w:w="50" w:type="dxa"/>
+              <w:right w:w="108" w:type="dxa"/>
+            </w:tcMar>
+          </w:tcPr>
+          <w:p>
+            <w:pPr>
+              <w:spacing w:before="20" w:after="20"/>
+              <w:jc w:val="center"/>
+            </w:pPr>
+            <w:r>
+              <w:rPr>
+                <w:b/>
+              </w:rPr>
+              <w:t>UC-13</w:t>
+            </w:r>
+          </w:p>
+        </w:tc>
+        <w:tc>
+          <w:tcPr>
+            <w:tcW w:w="2268" w:type="dxa"/>
+            <w:shd w:val="clear" w:color="auto" w:fill="F3FFF3"/>
+            <w:tcMar>
+              <w:top w:w="50" w:type="dxa"/>
+              <w:left w:w="108" w:type="dxa"/>
+              <w:bottom w:w="50" w:type="dxa"/>
+              <w:right w:w="108" w:type="dxa"/>
+            </w:tcMar>
+          </w:tcPr>
+          <w:p>
+            <w:pPr>
+              <w:spacing w:before="20" w:after="20"/>
+            </w:pPr>
+            <w:r>
+              <w:rPr>
+                <w:b/>
+              </w:rPr>
+              <w:t>Issue Electronic Prescription</w:t>
+            </w:r>
+          </w:p>
+        </w:tc>
+        <w:tc>
+          <w:tcPr>
+            <w:tcW w:w="1984" w:type="dxa"/>
+            <w:shd w:val="clear" w:color="auto" w:fill="F3FFF3"/>
+            <w:tcMar>
+              <w:top w:w="50" w:type="dxa"/>
+              <w:left w:w="108" w:type="dxa"/>
+              <w:bottom w:w="50" w:type="dxa"/>
+              <w:right w:w="108" w:type="dxa"/>
+            </w:tcMar>
+          </w:tcPr>
+          <w:p>
+            <w:pPr>
+              <w:spacing w:before="20" w:after="20"/>
+            </w:pPr>
+            <w:r>
+              <w:rPr>
+                <w:i/>
+              </w:rPr>
+              <w:t>EMR – Prescription Management</w:t>
+            </w:r>
+          </w:p>
+        </w:tc>
+        <w:tc>
+          <w:tcPr>
+            <w:tcW w:w="3969" w:type="dxa"/>
+            <w:shd w:val="clear" w:color="auto" w:fill="F3FFF3"/>
+            <w:tcMar>
+              <w:top w:w="50" w:type="dxa"/>
+              <w:left w:w="108" w:type="dxa"/>
+              <w:bottom w:w="50" w:type="dxa"/>
+              <w:right w:w="108" w:type="dxa"/>
+            </w:tcMar>
+          </w:tcPr>
+          <w:p>
+            <w:pPr>
+              <w:spacing w:before="20" w:after="20"/>
+            </w:pPr>
+            <w:r>
+              <w:t xml:space="preserve">After completing the VISIT record, the Doctor creates a PRESCRIPTION record by </w:t>
+            </w:r>
+            <w:r>
+              <w:lastRenderedPageBreak/>
+              <w:t>specifying each medicine (drug name with autocomplete suggestion), dosage amount, frequency, administration route, and duration. The saved PRESCRIPTION is automatically linked to the VISIT and PATIENT entities, and is visible to the Parent via the portal (UC-04).</w:t>
+            </w:r>
+          </w:p>
+        </w:tc>
+      </w:tr>
+      <w:tr>
+        <w:tc>
+          <w:tcPr>
+            <w:tcW w:w="850" w:type="dxa"/>
+            <w:shd w:val="clear" w:color="auto" w:fill="EBFFEB"/>
+            <w:tcMar>
+              <w:top w:w="50" w:type="dxa"/>
+              <w:left w:w="108" w:type="dxa"/>
+              <w:bottom w:w="50" w:type="dxa"/>
+              <w:right w:w="108" w:type="dxa"/>
+            </w:tcMar>
+          </w:tcPr>
+          <w:p>
+            <w:pPr>
+              <w:spacing w:before="20" w:after="20"/>
+              <w:jc w:val="center"/>
+            </w:pPr>
+            <w:r>
+              <w:rPr>
+                <w:b/>
+              </w:rPr>
+              <w:lastRenderedPageBreak/>
+              <w:t>UC-14</w:t>
+            </w:r>
+          </w:p>
+        </w:tc>
+        <w:tc>
+          <w:tcPr>
+            <w:tcW w:w="2268" w:type="dxa"/>
+            <w:shd w:val="clear" w:color="auto" w:fill="EBFFEB"/>
+            <w:tcMar>
+              <w:top w:w="50" w:type="dxa"/>
+              <w:left w:w="108" w:type="dxa"/>
+              <w:bottom w:w="50" w:type="dxa"/>
+              <w:right w:w="108" w:type="dxa"/>
+            </w:tcMar>
+          </w:tcPr>
+          <w:p>
+            <w:pPr>
+              <w:spacing w:before="20" w:after="20"/>
+            </w:pPr>
+            <w:r>
+              <w:rPr>
+                <w:b/>
+              </w:rPr>
+              <w:t>Manage Patient Profile</w:t>
+            </w:r>
+          </w:p>
+        </w:tc>
+        <w:tc>
+          <w:tcPr>
+            <w:tcW w:w="1984" w:type="dxa"/>
+            <w:shd w:val="clear" w:color="auto" w:fill="EBFFEB"/>
+            <w:tcMar>
+              <w:top w:w="50" w:type="dxa"/>
+              <w:left w:w="108" w:type="dxa"/>
+              <w:bottom w:w="50" w:type="dxa"/>
+              <w:right w:w="108" w:type="dxa"/>
+            </w:tcMar>
+          </w:tcPr>
+          <w:p>
+            <w:pPr>
+              <w:spacing w:before="20" w:after="20"/>
+            </w:pPr>
+            <w:r>
+              <w:rPr>
+                <w:i/>
+              </w:rPr>
+              <w:t>EMR – Patient Management</w:t>
+            </w:r>
+          </w:p>
+        </w:tc>
+        <w:tc>
+          <w:tcPr>
+            <w:tcW w:w="3969" w:type="dxa"/>
+            <w:shd w:val="clear" w:color="auto" w:fill="EBFFEB"/>
+            <w:tcMar>
+              <w:top w:w="50" w:type="dxa"/>
+              <w:left w:w="108" w:type="dxa"/>
+              <w:bottom w:w="50" w:type="dxa"/>
+              <w:right w:w="108" w:type="dxa"/>
+            </w:tcMar>
+          </w:tcPr>
+          <w:p>
+            <w:pPr>
+              <w:spacing w:before="20" w:after="20"/>
+            </w:pPr>
+            <w:r>
+              <w:t>The Doctor can view and update supplementary medical information in the PATIENT profile: known allergies, blood type, chronic condition flags, and vaccination notes. This ensures the EMR remains accurate and up-to-date for future clinical decisions by the same or other doctors at the clinic.</w:t>
+            </w:r>
+          </w:p>
+        </w:tc>
+      </w:tr>
+    </w:tbl>
+    <w:p/>
+    <w:p>
+      <w:pPr>
+        <w:pStyle w:val="Heading4"/>
+      </w:pPr>
+      <w:r>
+        <w:t>1.</w:t>
+      </w:r>
+      <w:r>
+        <w:t>3</w:t>
+      </w:r>
+      <w:r>
+        <w:t xml:space="preserve">.2 </w:t>
+      </w:r>
+      <w:r>
+        <w:t xml:space="preserve">Use Case </w:t>
+      </w:r>
+      <w:r>
+        <w:t>Diagrams</w:t>
+      </w:r>
+    </w:p>
+    <w:p>
+      <w:pPr>
+        <w:pStyle w:val="Heading5"/>
+      </w:pPr>
+      <w:r>
+        <w:t>1.</w:t>
+      </w:r>
+      <w:r>
+        <w:t>3</w:t>
+      </w:r>
+      <w:r>
+        <w:t xml:space="preserve">.2.1 </w:t>
+      </w:r>
+      <w:r>
+        <w:t>UCs for Parents</w:t>
+      </w:r>
+    </w:p>
+    <w:p>
+      <w:pPr>
+        <w:jc w:val="center"/>
         <w:rPr>
           <w:i/>
-          <w:color w:val="0000FF"/>
         </w:rPr>
-        <w:t>[Provide functionality overview of software system: screen flow, screen descriptions, system user roles, screen authorization, non-screen functions, ERD]</w:t>
+      </w:pPr>
+      <w:r>
+        <w:rPr>
+          <w:i/>
+        </w:rPr>
+        <w:drawing>
+          <wp:inline distT="0" distB="0" distL="0" distR="0" wp14:anchorId="760D3C53" wp14:editId="74D03F6C">
+            <wp:extent cx="5486400" cy="3514725"/>
+            <wp:effectExtent l="0" t="0" r="0" b="9525"/>
+            <wp:docPr id="1823949565" name="Picture 1"/>
+            <wp:cNvGraphicFramePr>
+              <a:graphicFrameLocks xmlns:a="http://schemas.openxmlformats.org/drawingml/2006/main" noChangeAspect="1"/>
+            </wp:cNvGraphicFramePr>
+            <a:graphic xmlns:a="http://schemas.openxmlformats.org/drawingml/2006/main">
+              <a:graphicData uri="http://schemas.openxmlformats.org/drawingml/2006/picture">
+                <pic:pic xmlns:pic="http://schemas.openxmlformats.org/drawingml/2006/picture">
+                  <pic:nvPicPr>
+                    <pic:cNvPr id="1823949565" name=""/>
+                    <pic:cNvPicPr/>
+                  </pic:nvPicPr>
+                  <pic:blipFill rotWithShape="1">
+                    <a:blip r:embed="rId13"/>
+                    <a:srcRect l="2155" r="2376" b="2053"/>
+                    <a:stretch>
+                      <a:fillRect/>
+                    </a:stretch>
+                  </pic:blipFill>
+                  <pic:spPr bwMode="auto">
+                    <a:xfrm>
+                      <a:off x="0" y="0"/>
+                      <a:ext cx="5486400" cy="3514725"/>
+                    </a:xfrm>
+                    <a:prstGeom prst="rect">
+                      <a:avLst/>
+                    </a:prstGeom>
+                    <a:ln>
+                      <a:noFill/>
+                    </a:ln>
+                    <a:extLst>
+                      <a:ext uri="{53640926-AAD7-44D8-BBD7-CCE9431645EC}">
+                        <a14:shadowObscured xmlns:a14="http://schemas.microsoft.com/office/drawing/2010/main"/>
+                      </a:ext>
+                    </a:extLst>
+                  </pic:spPr>
+                </pic:pic>
+              </a:graphicData>
+            </a:graphic>
+          </wp:inline>
+        </w:drawing>
+      </w:r>
+    </w:p>
+    <w:p/>
+    <w:p>
+      <w:pPr>
+        <w:pStyle w:val="Heading5"/>
+      </w:pPr>
+      <w:r>
+        <w:lastRenderedPageBreak/>
+        <w:t>1.</w:t>
+      </w:r>
+      <w:r>
+        <w:t>3</w:t>
+      </w:r>
+      <w:r>
+        <w:t xml:space="preserve">.2.2 UCs for </w:t>
+      </w:r>
+      <w:r>
+        <w:t>Receptionist</w:t>
       </w:r>
     </w:p>
     <w:p>
       <w:pPr>
-        <w:pStyle w:val="Heading4"/>
-      </w:pPr>
-      <w:r>
-        <w:t>1.4.1 Screens Flow</w:t>
+        <w:jc w:val="center"/>
+        <w:rPr>
+          <w:i/>
+        </w:rPr>
+      </w:pPr>
+      <w:r>
+        <w:rPr>
+          <w:i/>
+        </w:rPr>
+        <w:drawing>
+          <wp:inline distT="0" distB="0" distL="0" distR="0" wp14:anchorId="4B838D8E" wp14:editId="2B4C8770">
+            <wp:extent cx="5746750" cy="3153410"/>
+            <wp:effectExtent l="0" t="0" r="6350" b="8890"/>
+            <wp:docPr id="497829677" name="Picture 1"/>
+            <wp:cNvGraphicFramePr>
+              <a:graphicFrameLocks xmlns:a="http://schemas.openxmlformats.org/drawingml/2006/main" noChangeAspect="1"/>
+            </wp:cNvGraphicFramePr>
+            <a:graphic xmlns:a="http://schemas.openxmlformats.org/drawingml/2006/main">
+              <a:graphicData uri="http://schemas.openxmlformats.org/drawingml/2006/picture">
+                <pic:pic xmlns:pic="http://schemas.openxmlformats.org/drawingml/2006/picture">
+                  <pic:nvPicPr>
+                    <pic:cNvPr id="497829677" name=""/>
+                    <pic:cNvPicPr/>
+                  </pic:nvPicPr>
+                  <pic:blipFill>
+                    <a:blip r:embed="rId14"/>
+                    <a:stretch>
+                      <a:fillRect/>
+                    </a:stretch>
+                  </pic:blipFill>
+                  <pic:spPr>
+                    <a:xfrm>
+                      <a:off x="0" y="0"/>
+                      <a:ext cx="5746750" cy="3153410"/>
+                    </a:xfrm>
+                    <a:prstGeom prst="rect">
+                      <a:avLst/>
+                    </a:prstGeom>
+                  </pic:spPr>
+                </pic:pic>
+              </a:graphicData>
+            </a:graphic>
+          </wp:inline>
+        </w:drawing>
       </w:r>
     </w:p>
     <w:p>
       <w:pPr>
-        <w:jc w:val="both"/>
-        <w:rPr>
-          <w:i/>
-          <w:color w:val="0000FF"/>
-        </w:rPr>
-      </w:pPr>
-      <w:r>
-        <w:rPr>
-          <w:i/>
-          <w:color w:val="0000FF"/>
-        </w:rPr>
-        <w:t>[This part shows the system screens and the relationship among screens. You can draw the Screens Flow for the system in the form of diagram as below.]</w:t>
+        <w:pStyle w:val="Heading5"/>
+      </w:pPr>
+      <w:r>
+        <w:t>1.</w:t>
+      </w:r>
+      <w:r>
+        <w:t>3</w:t>
+      </w:r>
+      <w:r>
+        <w:t>.2.3</w:t>
+      </w:r>
+      <w:r>
+        <w:t xml:space="preserve"> </w:t>
+      </w:r>
+      <w:r>
+        <w:t>UCs for Doctors</w:t>
+      </w:r>
+    </w:p>
+    <w:p>
+      <w:r>
+        <w:drawing>
+          <wp:inline distT="0" distB="0" distL="0" distR="0" wp14:anchorId="7C83F212" wp14:editId="2E9530DF">
+            <wp:extent cx="5746750" cy="3382010"/>
+            <wp:effectExtent l="0" t="0" r="6350" b="8890"/>
+            <wp:docPr id="1373666755" name="Picture 1"/>
+            <wp:cNvGraphicFramePr>
+              <a:graphicFrameLocks xmlns:a="http://schemas.openxmlformats.org/drawingml/2006/main" noChangeAspect="1"/>
+            </wp:cNvGraphicFramePr>
+            <a:graphic xmlns:a="http://schemas.openxmlformats.org/drawingml/2006/main">
+              <a:graphicData uri="http://schemas.openxmlformats.org/drawingml/2006/picture">
+                <pic:pic xmlns:pic="http://schemas.openxmlformats.org/drawingml/2006/picture">
+                  <pic:nvPicPr>
+                    <pic:cNvPr id="1373666755" name=""/>
+                    <pic:cNvPicPr/>
+                  </pic:nvPicPr>
+                  <pic:blipFill>
+                    <a:blip r:embed="rId15"/>
+                    <a:stretch>
+                      <a:fillRect/>
+                    </a:stretch>
+                  </pic:blipFill>
+                  <pic:spPr>
+                    <a:xfrm>
+                      <a:off x="0" y="0"/>
+                      <a:ext cx="5746750" cy="3382010"/>
+                    </a:xfrm>
+                    <a:prstGeom prst="rect">
+                      <a:avLst/>
+                    </a:prstGeom>
+                  </pic:spPr>
+                </pic:pic>
+              </a:graphicData>
+            </a:graphic>
+          </wp:inline>
+        </w:drawing>
+      </w:r>
+    </w:p>
+    <w:p/>
+    <w:p>
+      <w:pPr>
+        <w:pStyle w:val="Heading3"/>
+      </w:pPr>
+      <w:bookmarkStart w:id="6" w:name="_Toc187341936"/>
+      <w:r>
+        <w:lastRenderedPageBreak/>
+        <w:t>1.4 System Functionalities</w:t>
+      </w:r>
+      <w:bookmarkEnd w:id="6"/>
+    </w:p>
+    <w:p>
+      <w:pPr>
+        <w:pStyle w:val="Heading4"/>
+      </w:pPr>
+      <w:r>
+        <w:t>1.4.1 Screens Flow</w:t>
       </w:r>
     </w:p>
     <w:p>
@@ -4923,7 +5606,7 @@
                     <pic:cNvPicPr preferRelativeResize="0"/>
                   </pic:nvPicPr>
                   <pic:blipFill>
-                    <a:blip r:embed="rId13"/>
+                    <a:blip r:embed="rId16"/>
                     <a:srcRect/>
                     <a:stretch>
                       <a:fillRect/>
@@ -4952,22 +5635,6 @@
       </w:pPr>
       <w:r>
         <w:t>1.4.2 Screen Authorization</w:t>
-      </w:r>
-    </w:p>
-    <w:p>
-      <w:pPr>
-        <w:jc w:val="both"/>
-        <w:rPr>
-          <w:i/>
-          <w:color w:val="0000FF"/>
-        </w:rPr>
-      </w:pPr>
-      <w:r>
-        <w:rPr>
-          <w:i/>
-          <w:color w:val="0000FF"/>
-        </w:rPr>
-        <w:t>[Provide the system roles authorization to the system features (down to screens, and event to the screen activities if applicable) in the table form as below – replace Role-Name1, Role-Name2,… with your specific system user role names]</w:t>
       </w:r>
     </w:p>
     <w:tbl>
@@ -5111,7 +5778,6 @@
         <w:tc>
           <w:tcPr>
             <w:tcW w:w="3119" w:type="dxa"/>
-            <w:shd w:val="clear" w:color="auto" w:fill="auto"/>
             <w:vAlign w:val="bottom"/>
           </w:tcPr>
           <w:p>
@@ -5132,7 +5798,6 @@
         <w:tc>
           <w:tcPr>
             <w:tcW w:w="1417" w:type="dxa"/>
-            <w:shd w:val="clear" w:color="auto" w:fill="auto"/>
             <w:vAlign w:val="bottom"/>
           </w:tcPr>
           <w:p>
@@ -5213,7 +5878,6 @@
         <w:tc>
           <w:tcPr>
             <w:tcW w:w="3119" w:type="dxa"/>
-            <w:shd w:val="clear" w:color="auto" w:fill="auto"/>
             <w:vAlign w:val="bottom"/>
           </w:tcPr>
           <w:p>
@@ -5234,7 +5898,6 @@
         <w:tc>
           <w:tcPr>
             <w:tcW w:w="1417" w:type="dxa"/>
-            <w:shd w:val="clear" w:color="auto" w:fill="auto"/>
             <w:vAlign w:val="bottom"/>
           </w:tcPr>
           <w:p>
@@ -5303,7 +5966,6 @@
         <w:tc>
           <w:tcPr>
             <w:tcW w:w="3119" w:type="dxa"/>
-            <w:shd w:val="clear" w:color="auto" w:fill="auto"/>
             <w:vAlign w:val="bottom"/>
           </w:tcPr>
           <w:p>
@@ -5324,7 +5986,6 @@
         <w:tc>
           <w:tcPr>
             <w:tcW w:w="1417" w:type="dxa"/>
-            <w:shd w:val="clear" w:color="auto" w:fill="auto"/>
             <w:vAlign w:val="bottom"/>
           </w:tcPr>
           <w:p>
@@ -5527,7 +6188,6 @@
         <w:tc>
           <w:tcPr>
             <w:tcW w:w="362" w:type="dxa"/>
-            <w:shd w:val="clear" w:color="auto" w:fill="auto"/>
           </w:tcPr>
           <w:p>
             <w:pPr>
@@ -5554,7 +6214,6 @@
         <w:tc>
           <w:tcPr>
             <w:tcW w:w="2268" w:type="dxa"/>
-            <w:shd w:val="clear" w:color="auto" w:fill="auto"/>
           </w:tcPr>
           <w:p>
             <w:pPr>
@@ -5568,7 +6227,6 @@
         <w:tc>
           <w:tcPr>
             <w:tcW w:w="4530" w:type="dxa"/>
-            <w:shd w:val="clear" w:color="auto" w:fill="auto"/>
           </w:tcPr>
           <w:p>
             <w:pPr>
@@ -5584,7 +6242,6 @@
         <w:tc>
           <w:tcPr>
             <w:tcW w:w="362" w:type="dxa"/>
-            <w:shd w:val="clear" w:color="auto" w:fill="auto"/>
           </w:tcPr>
           <w:p>
             <w:pPr>
@@ -5611,7 +6268,6 @@
         <w:tc>
           <w:tcPr>
             <w:tcW w:w="2268" w:type="dxa"/>
-            <w:shd w:val="clear" w:color="auto" w:fill="auto"/>
           </w:tcPr>
           <w:p>
             <w:pPr>
@@ -5622,7 +6278,6 @@
         <w:tc>
           <w:tcPr>
             <w:tcW w:w="4530" w:type="dxa"/>
-            <w:shd w:val="clear" w:color="auto" w:fill="auto"/>
           </w:tcPr>
           <w:p>
             <w:pPr>
@@ -5695,7 +6350,6 @@
         <w:rPr>
           <w:noProof/>
         </w:rPr>
-        <w:lastRenderedPageBreak/>
         <w:drawing>
           <wp:inline distT="0" distB="0" distL="0" distR="0" wp14:anchorId="0ED67168" wp14:editId="53C9525C">
             <wp:extent cx="5343525" cy="2371725"/>
@@ -5710,7 +6364,7 @@
                     <pic:cNvPicPr preferRelativeResize="0"/>
                   </pic:nvPicPr>
                   <pic:blipFill>
-                    <a:blip r:embed="rId14"/>
+                    <a:blip r:embed="rId17"/>
                     <a:srcRect/>
                     <a:stretch>
                       <a:fillRect/>
@@ -5745,6 +6399,7 @@
           <w:b/>
           <w:u w:val="single"/>
         </w:rPr>
+        <w:lastRenderedPageBreak/>
         <w:t xml:space="preserve">Entities </w:t>
       </w:r>
       <w:r>
@@ -6427,7 +7082,6 @@
         <w:spacing w:after="120" w:line="220" w:lineRule="auto"/>
       </w:pPr>
       <w:r>
-        <w:lastRenderedPageBreak/>
         <w:t xml:space="preserve">List any activities that must take place, or any conditions that must be true, before the use case can be started. </w:t>
       </w:r>
     </w:p>
@@ -6526,6 +7180,7 @@
         <w:ind w:left="567" w:hanging="283"/>
       </w:pPr>
       <w:r>
+        <w:lastRenderedPageBreak/>
         <w:t>Any anticipated error conditions that could occur during execution of the use case and how the system is to respond to those conditions.</w:t>
       </w:r>
     </w:p>
@@ -7346,7 +8001,6 @@
               <w:rPr>
                 <w:color w:val="000000"/>
               </w:rPr>
-              <w:lastRenderedPageBreak/>
               <w:t>The user account is blocked / inactive (MSG12)</w:t>
             </w:r>
           </w:p>
@@ -8341,7 +8995,7 @@
                     <pic:cNvPicPr preferRelativeResize="0"/>
                   </pic:nvPicPr>
                   <pic:blipFill>
-                    <a:blip r:embed="rId15"/>
+                    <a:blip r:embed="rId18"/>
                     <a:srcRect/>
                     <a:stretch>
                       <a:fillRect/>
@@ -8664,7 +9318,7 @@
                     <pic:cNvPicPr preferRelativeResize="0"/>
                   </pic:nvPicPr>
                   <pic:blipFill>
-                    <a:blip r:embed="rId16"/>
+                    <a:blip r:embed="rId19"/>
                     <a:srcRect/>
                     <a:stretch>
                       <a:fillRect/>
@@ -11216,7 +11870,7 @@
       <w:bookmarkEnd w:id="46"/>
     </w:p>
     <w:sectPr>
-      <w:footerReference w:type="default" r:id="rId17"/>
+      <w:footerReference w:type="default" r:id="rId20"/>
       <w:pgSz w:w="11906" w:h="16838"/>
       <w:pgMar w:top="1440" w:right="1416" w:bottom="1440" w:left="1440" w:header="708" w:footer="708" w:gutter="0"/>
       <w:pgNumType w:start="1"/>
@@ -11228,7 +11882,7 @@
 </file>
 
 <file path=word/endnotes.xml><?xml version="1.0" encoding="utf-8"?>
-<w:endnotes xmlns:wpc="http://schemas.microsoft.com/office/word/2010/wordprocessingCanvas" xmlns:cx="http://schemas.microsoft.com/office/drawing/2014/chartex" xmlns:cx1="http://schemas.microsoft.com/office/drawing/2015/9/8/chartex" xmlns:cx2="http://schemas.microsoft.com/office/drawing/2015/10/21/chartex" xmlns:cx3="http://schemas.microsoft.com/office/drawing/2016/5/9/chartex" xmlns:cx4="http://schemas.microsoft.com/office/drawing/2016/5/10/chartex" xmlns:cx5="http://schemas.microsoft.com/office/drawing/2016/5/11/chartex" xmlns:cx6="http://schemas.microsoft.com/office/drawing/2016/5/12/chartex" xmlns:cx7="http://schemas.microsoft.com/office/drawing/2016/5/13/chartex" xmlns:cx8="http://schemas.microsoft.com/office/drawing/2016/5/14/chartex" xmlns:mc="http://schemas.openxmlformats.org/markup-compatibility/2006" xmlns:aink="http://schemas.microsoft.com/office/drawing/2016/ink" xmlns:am3d="http://schemas.microsoft.com/office/drawing/2017/model3d" xmlns:o="urn:schemas-microsoft-com:office:office" xmlns:r="http://schemas.openxmlformats.org/officeDocument/2006/relationships" xmlns:m="http://schemas.openxmlformats.org/officeDocument/2006/math" xmlns:v="urn:schemas-microsoft-com:vml" xmlns:wp14="http://schemas.microsoft.com/office/word/2010/wordprocessingDrawing" xmlns:wp="http://schemas.openxmlformats.org/drawingml/2006/wordprocessingDrawing" xmlns:w10="urn:schemas-microsoft-com:office:word" xmlns:w="http://schemas.openxmlformats.org/wordprocessingml/2006/main" xmlns:w14="http://schemas.microsoft.com/office/word/2010/wordml" xmlns:w15="http://schemas.microsoft.com/office/word/2012/wordml" xmlns:w16cex="http://schemas.microsoft.com/office/word/2018/wordml/cex" xmlns:w16cid="http://schemas.microsoft.com/office/word/2016/wordml/cid" xmlns:w16="http://schemas.microsoft.com/office/word/2018/wordml" xmlns:w16sdtdh="http://schemas.microsoft.com/office/word/2020/wordml/sdtdatahash" xmlns:w16se="http://schemas.microsoft.com/office/word/2015/wordml/symex" xmlns:wpg="http://schemas.microsoft.com/office/word/2010/wordprocessingGroup" xmlns:wpi="http://schemas.microsoft.com/office/word/2010/wordprocessingInk" xmlns:wne="http://schemas.microsoft.com/office/word/2006/wordml" xmlns:wps="http://schemas.microsoft.com/office/word/2010/wordprocessingShape" mc:Ignorable="w14 w15 w16se w16cid w16 w16cex w16sdtdh wp14">
+<w:endnotes xmlns:wpc="http://schemas.microsoft.com/office/word/2010/wordprocessingCanvas" xmlns:cx="http://schemas.microsoft.com/office/drawing/2014/chartex" xmlns:cx1="http://schemas.microsoft.com/office/drawing/2015/9/8/chartex" xmlns:cx2="http://schemas.microsoft.com/office/drawing/2015/10/21/chartex" xmlns:cx3="http://schemas.microsoft.com/office/drawing/2016/5/9/chartex" xmlns:cx4="http://schemas.microsoft.com/office/drawing/2016/5/10/chartex" xmlns:cx5="http://schemas.microsoft.com/office/drawing/2016/5/11/chartex" xmlns:cx6="http://schemas.microsoft.com/office/drawing/2016/5/12/chartex" xmlns:cx7="http://schemas.microsoft.com/office/drawing/2016/5/13/chartex" xmlns:cx8="http://schemas.microsoft.com/office/drawing/2016/5/14/chartex" xmlns:mc="http://schemas.openxmlformats.org/markup-compatibility/2006" xmlns:aink="http://schemas.microsoft.com/office/drawing/2016/ink" xmlns:am3d="http://schemas.microsoft.com/office/drawing/2017/model3d" xmlns:o="urn:schemas-microsoft-com:office:office" xmlns:oel="http://schemas.microsoft.com/office/2019/extlst" xmlns:r="http://schemas.openxmlformats.org/officeDocument/2006/relationships" xmlns:m="http://schemas.openxmlformats.org/officeDocument/2006/math" xmlns:v="urn:schemas-microsoft-com:vml" xmlns:wp14="http://schemas.microsoft.com/office/word/2010/wordprocessingDrawing" xmlns:wp="http://schemas.openxmlformats.org/drawingml/2006/wordprocessingDrawing" xmlns:w10="urn:schemas-microsoft-com:office:word" xmlns:w="http://schemas.openxmlformats.org/wordprocessingml/2006/main" xmlns:w14="http://schemas.microsoft.com/office/word/2010/wordml" xmlns:w15="http://schemas.microsoft.com/office/word/2012/wordml" xmlns:w16cex="http://schemas.microsoft.com/office/word/2018/wordml/cex" xmlns:w16cid="http://schemas.microsoft.com/office/word/2016/wordml/cid" xmlns:w16="http://schemas.microsoft.com/office/word/2018/wordml" xmlns:w16du="http://schemas.microsoft.com/office/word/2023/wordml/word16du" xmlns:w16sdtdh="http://schemas.microsoft.com/office/word/2020/wordml/sdtdatahash" xmlns:w16sdtfl="http://schemas.microsoft.com/office/word/2024/wordml/sdtformatlock" xmlns:w16se="http://schemas.microsoft.com/office/word/2015/wordml/symex" xmlns:wpg="http://schemas.microsoft.com/office/word/2010/wordprocessingGroup" xmlns:wpi="http://schemas.microsoft.com/office/word/2010/wordprocessingInk" xmlns:wne="http://schemas.microsoft.com/office/word/2006/wordml" xmlns:wps="http://schemas.microsoft.com/office/word/2010/wordprocessingShape" mc:Ignorable="w14 w15 w16se w16cid w16 w16cex w16sdtdh w16sdtfl w16du wp14">
   <w:endnote w:type="separator" w:id="-1">
     <w:p>
       <w:pPr>
@@ -11253,7 +11907,7 @@
 </file>
 
 <file path=word/footer1.xml><?xml version="1.0" encoding="utf-8"?>
-<w:ftr xmlns:wpc="http://schemas.microsoft.com/office/word/2010/wordprocessingCanvas" xmlns:cx="http://schemas.microsoft.com/office/drawing/2014/chartex" xmlns:cx1="http://schemas.microsoft.com/office/drawing/2015/9/8/chartex" xmlns:cx2="http://schemas.microsoft.com/office/drawing/2015/10/21/chartex" xmlns:cx3="http://schemas.microsoft.com/office/drawing/2016/5/9/chartex" xmlns:cx4="http://schemas.microsoft.com/office/drawing/2016/5/10/chartex" xmlns:cx5="http://schemas.microsoft.com/office/drawing/2016/5/11/chartex" xmlns:cx6="http://schemas.microsoft.com/office/drawing/2016/5/12/chartex" xmlns:cx7="http://schemas.microsoft.com/office/drawing/2016/5/13/chartex" xmlns:cx8="http://schemas.microsoft.com/office/drawing/2016/5/14/chartex" xmlns:mc="http://schemas.openxmlformats.org/markup-compatibility/2006" xmlns:aink="http://schemas.microsoft.com/office/drawing/2016/ink" xmlns:am3d="http://schemas.microsoft.com/office/drawing/2017/model3d" xmlns:o="urn:schemas-microsoft-com:office:office" xmlns:r="http://schemas.openxmlformats.org/officeDocument/2006/relationships" xmlns:m="http://schemas.openxmlformats.org/officeDocument/2006/math" xmlns:v="urn:schemas-microsoft-com:vml" xmlns:wp14="http://schemas.microsoft.com/office/word/2010/wordprocessingDrawing" xmlns:wp="http://schemas.openxmlformats.org/drawingml/2006/wordprocessingDrawing" xmlns:w10="urn:schemas-microsoft-com:office:word" xmlns:w="http://schemas.openxmlformats.org/wordprocessingml/2006/main" xmlns:w14="http://schemas.microsoft.com/office/word/2010/wordml" xmlns:w15="http://schemas.microsoft.com/office/word/2012/wordml" xmlns:w16cex="http://schemas.microsoft.com/office/word/2018/wordml/cex" xmlns:w16cid="http://schemas.microsoft.com/office/word/2016/wordml/cid" xmlns:w16="http://schemas.microsoft.com/office/word/2018/wordml" xmlns:w16sdtdh="http://schemas.microsoft.com/office/word/2020/wordml/sdtdatahash" xmlns:w16se="http://schemas.microsoft.com/office/word/2015/wordml/symex" xmlns:wpg="http://schemas.microsoft.com/office/word/2010/wordprocessingGroup" xmlns:wpi="http://schemas.microsoft.com/office/word/2010/wordprocessingInk" xmlns:wne="http://schemas.microsoft.com/office/word/2006/wordml" xmlns:wps="http://schemas.microsoft.com/office/word/2010/wordprocessingShape" mc:Ignorable="w14 w15 w16se w16cid w16 w16cex w16sdtdh wp14">
+<w:ftr xmlns:wpc="http://schemas.microsoft.com/office/word/2010/wordprocessingCanvas" xmlns:cx="http://schemas.microsoft.com/office/drawing/2014/chartex" xmlns:cx1="http://schemas.microsoft.com/office/drawing/2015/9/8/chartex" xmlns:cx2="http://schemas.microsoft.com/office/drawing/2015/10/21/chartex" xmlns:cx3="http://schemas.microsoft.com/office/drawing/2016/5/9/chartex" xmlns:cx4="http://schemas.microsoft.com/office/drawing/2016/5/10/chartex" xmlns:cx5="http://schemas.microsoft.com/office/drawing/2016/5/11/chartex" xmlns:cx6="http://schemas.microsoft.com/office/drawing/2016/5/12/chartex" xmlns:cx7="http://schemas.microsoft.com/office/drawing/2016/5/13/chartex" xmlns:cx8="http://schemas.microsoft.com/office/drawing/2016/5/14/chartex" xmlns:mc="http://schemas.openxmlformats.org/markup-compatibility/2006" xmlns:aink="http://schemas.microsoft.com/office/drawing/2016/ink" xmlns:am3d="http://schemas.microsoft.com/office/drawing/2017/model3d" xmlns:o="urn:schemas-microsoft-com:office:office" xmlns:oel="http://schemas.microsoft.com/office/2019/extlst" xmlns:r="http://schemas.openxmlformats.org/officeDocument/2006/relationships" xmlns:m="http://schemas.openxmlformats.org/officeDocument/2006/math" xmlns:v="urn:schemas-microsoft-com:vml" xmlns:wp14="http://schemas.microsoft.com/office/word/2010/wordprocessingDrawing" xmlns:wp="http://schemas.openxmlformats.org/drawingml/2006/wordprocessingDrawing" xmlns:w10="urn:schemas-microsoft-com:office:word" xmlns:w="http://schemas.openxmlformats.org/wordprocessingml/2006/main" xmlns:w14="http://schemas.microsoft.com/office/word/2010/wordml" xmlns:w15="http://schemas.microsoft.com/office/word/2012/wordml" xmlns:w16cex="http://schemas.microsoft.com/office/word/2018/wordml/cex" xmlns:w16cid="http://schemas.microsoft.com/office/word/2016/wordml/cid" xmlns:w16="http://schemas.microsoft.com/office/word/2018/wordml" xmlns:w16du="http://schemas.microsoft.com/office/word/2023/wordml/word16du" xmlns:w16sdtdh="http://schemas.microsoft.com/office/word/2020/wordml/sdtdatahash" xmlns:w16sdtfl="http://schemas.microsoft.com/office/word/2024/wordml/sdtformatlock" xmlns:w16se="http://schemas.microsoft.com/office/word/2015/wordml/symex" xmlns:wpg="http://schemas.microsoft.com/office/word/2010/wordprocessingGroup" xmlns:wpi="http://schemas.microsoft.com/office/word/2010/wordprocessingInk" xmlns:wne="http://schemas.microsoft.com/office/word/2006/wordml" xmlns:wps="http://schemas.microsoft.com/office/word/2010/wordprocessingShape" mc:Ignorable="w14 w15 w16se w16cid w16 w16cex w16sdtdh w16sdtfl w16du wp14">
   <w:p>
     <w:pPr>
       <w:widowControl w:val="0"/>
@@ -11449,7 +12103,7 @@
 </file>
 
 <file path=word/footnotes.xml><?xml version="1.0" encoding="utf-8"?>
-<w:footnotes xmlns:wpc="http://schemas.microsoft.com/office/word/2010/wordprocessingCanvas" xmlns:cx="http://schemas.microsoft.com/office/drawing/2014/chartex" xmlns:cx1="http://schemas.microsoft.com/office/drawing/2015/9/8/chartex" xmlns:cx2="http://schemas.microsoft.com/office/drawing/2015/10/21/chartex" xmlns:cx3="http://schemas.microsoft.com/office/drawing/2016/5/9/chartex" xmlns:cx4="http://schemas.microsoft.com/office/drawing/2016/5/10/chartex" xmlns:cx5="http://schemas.microsoft.com/office/drawing/2016/5/11/chartex" xmlns:cx6="http://schemas.microsoft.com/office/drawing/2016/5/12/chartex" xmlns:cx7="http://schemas.microsoft.com/office/drawing/2016/5/13/chartex" xmlns:cx8="http://schemas.microsoft.com/office/drawing/2016/5/14/chartex" xmlns:mc="http://schemas.openxmlformats.org/markup-compatibility/2006" xmlns:aink="http://schemas.microsoft.com/office/drawing/2016/ink" xmlns:am3d="http://schemas.microsoft.com/office/drawing/2017/model3d" xmlns:o="urn:schemas-microsoft-com:office:office" xmlns:r="http://schemas.openxmlformats.org/officeDocument/2006/relationships" xmlns:m="http://schemas.openxmlformats.org/officeDocument/2006/math" xmlns:v="urn:schemas-microsoft-com:vml" xmlns:wp14="http://schemas.microsoft.com/office/word/2010/wordprocessingDrawing" xmlns:wp="http://schemas.openxmlformats.org/drawingml/2006/wordprocessingDrawing" xmlns:w10="urn:schemas-microsoft-com:office:word" xmlns:w="http://schemas.openxmlformats.org/wordprocessingml/2006/main" xmlns:w14="http://schemas.microsoft.com/office/word/2010/wordml" xmlns:w15="http://schemas.microsoft.com/office/word/2012/wordml" xmlns:w16cex="http://schemas.microsoft.com/office/word/2018/wordml/cex" xmlns:w16cid="http://schemas.microsoft.com/office/word/2016/wordml/cid" xmlns:w16="http://schemas.microsoft.com/office/word/2018/wordml" xmlns:w16sdtdh="http://schemas.microsoft.com/office/word/2020/wordml/sdtdatahash" xmlns:w16se="http://schemas.microsoft.com/office/word/2015/wordml/symex" xmlns:wpg="http://schemas.microsoft.com/office/word/2010/wordprocessingGroup" xmlns:wpi="http://schemas.microsoft.com/office/word/2010/wordprocessingInk" xmlns:wne="http://schemas.microsoft.com/office/word/2006/wordml" xmlns:wps="http://schemas.microsoft.com/office/word/2010/wordprocessingShape" mc:Ignorable="w14 w15 w16se w16cid w16 w16cex w16sdtdh wp14">
+<w:footnotes xmlns:wpc="http://schemas.microsoft.com/office/word/2010/wordprocessingCanvas" xmlns:cx="http://schemas.microsoft.com/office/drawing/2014/chartex" xmlns:cx1="http://schemas.microsoft.com/office/drawing/2015/9/8/chartex" xmlns:cx2="http://schemas.microsoft.com/office/drawing/2015/10/21/chartex" xmlns:cx3="http://schemas.microsoft.com/office/drawing/2016/5/9/chartex" xmlns:cx4="http://schemas.microsoft.com/office/drawing/2016/5/10/chartex" xmlns:cx5="http://schemas.microsoft.com/office/drawing/2016/5/11/chartex" xmlns:cx6="http://schemas.microsoft.com/office/drawing/2016/5/12/chartex" xmlns:cx7="http://schemas.microsoft.com/office/drawing/2016/5/13/chartex" xmlns:cx8="http://schemas.microsoft.com/office/drawing/2016/5/14/chartex" xmlns:mc="http://schemas.openxmlformats.org/markup-compatibility/2006" xmlns:aink="http://schemas.microsoft.com/office/drawing/2016/ink" xmlns:am3d="http://schemas.microsoft.com/office/drawing/2017/model3d" xmlns:o="urn:schemas-microsoft-com:office:office" xmlns:oel="http://schemas.microsoft.com/office/2019/extlst" xmlns:r="http://schemas.openxmlformats.org/officeDocument/2006/relationships" xmlns:m="http://schemas.openxmlformats.org/officeDocument/2006/math" xmlns:v="urn:schemas-microsoft-com:vml" xmlns:wp14="http://schemas.microsoft.com/office/word/2010/wordprocessingDrawing" xmlns:wp="http://schemas.openxmlformats.org/drawingml/2006/wordprocessingDrawing" xmlns:w10="urn:schemas-microsoft-com:office:word" xmlns:w="http://schemas.openxmlformats.org/wordprocessingml/2006/main" xmlns:w14="http://schemas.microsoft.com/office/word/2010/wordml" xmlns:w15="http://schemas.microsoft.com/office/word/2012/wordml" xmlns:w16cex="http://schemas.microsoft.com/office/word/2018/wordml/cex" xmlns:w16cid="http://schemas.microsoft.com/office/word/2016/wordml/cid" xmlns:w16="http://schemas.microsoft.com/office/word/2018/wordml" xmlns:w16du="http://schemas.microsoft.com/office/word/2023/wordml/word16du" xmlns:w16sdtdh="http://schemas.microsoft.com/office/word/2020/wordml/sdtdatahash" xmlns:w16sdtfl="http://schemas.microsoft.com/office/word/2024/wordml/sdtformatlock" xmlns:w16se="http://schemas.microsoft.com/office/word/2015/wordml/symex" xmlns:wpg="http://schemas.microsoft.com/office/word/2010/wordprocessingGroup" xmlns:wpi="http://schemas.microsoft.com/office/word/2010/wordprocessingInk" xmlns:wne="http://schemas.microsoft.com/office/word/2006/wordml" xmlns:wps="http://schemas.microsoft.com/office/word/2010/wordprocessingShape" mc:Ignorable="w14 w15 w16se w16cid w16 w16cex w16sdtdh w16sdtfl w16du wp14">
   <w:footnote w:type="separator" w:id="-1">
     <w:p>
       <w:pPr>
@@ -11474,7 +12128,7 @@
 </file>
 
 <file path=word/numbering.xml><?xml version="1.0" encoding="utf-8"?>
-<w:numbering xmlns:wpc="http://schemas.microsoft.com/office/word/2010/wordprocessingCanvas" xmlns:cx="http://schemas.microsoft.com/office/drawing/2014/chartex" xmlns:cx1="http://schemas.microsoft.com/office/drawing/2015/9/8/chartex" xmlns:cx2="http://schemas.microsoft.com/office/drawing/2015/10/21/chartex" xmlns:cx3="http://schemas.microsoft.com/office/drawing/2016/5/9/chartex" xmlns:cx4="http://schemas.microsoft.com/office/drawing/2016/5/10/chartex" xmlns:cx5="http://schemas.microsoft.com/office/drawing/2016/5/11/chartex" xmlns:cx6="http://schemas.microsoft.com/office/drawing/2016/5/12/chartex" xmlns:cx7="http://schemas.microsoft.com/office/drawing/2016/5/13/chartex" xmlns:cx8="http://schemas.microsoft.com/office/drawing/2016/5/14/chartex" xmlns:mc="http://schemas.openxmlformats.org/markup-compatibility/2006" xmlns:aink="http://schemas.microsoft.com/office/drawing/2016/ink" xmlns:am3d="http://schemas.microsoft.com/office/drawing/2017/model3d" xmlns:o="urn:schemas-microsoft-com:office:office" xmlns:r="http://schemas.openxmlformats.org/officeDocument/2006/relationships" xmlns:m="http://schemas.openxmlformats.org/officeDocument/2006/math" xmlns:v="urn:schemas-microsoft-com:vml" xmlns:wp14="http://schemas.microsoft.com/office/word/2010/wordprocessingDrawing" xmlns:wp="http://schemas.openxmlformats.org/drawingml/2006/wordprocessingDrawing" xmlns:w10="urn:schemas-microsoft-com:office:word" xmlns:w="http://schemas.openxmlformats.org/wordprocessingml/2006/main" xmlns:w14="http://schemas.microsoft.com/office/word/2010/wordml" xmlns:w15="http://schemas.microsoft.com/office/word/2012/wordml" xmlns:w16cex="http://schemas.microsoft.com/office/word/2018/wordml/cex" xmlns:w16cid="http://schemas.microsoft.com/office/word/2016/wordml/cid" xmlns:w16="http://schemas.microsoft.com/office/word/2018/wordml" xmlns:w16sdtdh="http://schemas.microsoft.com/office/word/2020/wordml/sdtdatahash" xmlns:w16se="http://schemas.microsoft.com/office/word/2015/wordml/symex" xmlns:wpg="http://schemas.microsoft.com/office/word/2010/wordprocessingGroup" xmlns:wpi="http://schemas.microsoft.com/office/word/2010/wordprocessingInk" xmlns:wne="http://schemas.microsoft.com/office/word/2006/wordml" xmlns:wps="http://schemas.microsoft.com/office/word/2010/wordprocessingShape" mc:Ignorable="w14 w15 w16se w16cid w16 w16cex w16sdtdh wp14">
+<w:numbering xmlns:wpc="http://schemas.microsoft.com/office/word/2010/wordprocessingCanvas" xmlns:cx="http://schemas.microsoft.com/office/drawing/2014/chartex" xmlns:cx1="http://schemas.microsoft.com/office/drawing/2015/9/8/chartex" xmlns:cx2="http://schemas.microsoft.com/office/drawing/2015/10/21/chartex" xmlns:cx3="http://schemas.microsoft.com/office/drawing/2016/5/9/chartex" xmlns:cx4="http://schemas.microsoft.com/office/drawing/2016/5/10/chartex" xmlns:cx5="http://schemas.microsoft.com/office/drawing/2016/5/11/chartex" xmlns:cx6="http://schemas.microsoft.com/office/drawing/2016/5/12/chartex" xmlns:cx7="http://schemas.microsoft.com/office/drawing/2016/5/13/chartex" xmlns:cx8="http://schemas.microsoft.com/office/drawing/2016/5/14/chartex" xmlns:mc="http://schemas.openxmlformats.org/markup-compatibility/2006" xmlns:aink="http://schemas.microsoft.com/office/drawing/2016/ink" xmlns:am3d="http://schemas.microsoft.com/office/drawing/2017/model3d" xmlns:o="urn:schemas-microsoft-com:office:office" xmlns:oel="http://schemas.microsoft.com/office/2019/extlst" xmlns:r="http://schemas.openxmlformats.org/officeDocument/2006/relationships" xmlns:m="http://schemas.openxmlformats.org/officeDocument/2006/math" xmlns:v="urn:schemas-microsoft-com:vml" xmlns:wp14="http://schemas.microsoft.com/office/word/2010/wordprocessingDrawing" xmlns:wp="http://schemas.openxmlformats.org/drawingml/2006/wordprocessingDrawing" xmlns:w10="urn:schemas-microsoft-com:office:word" xmlns:w="http://schemas.openxmlformats.org/wordprocessingml/2006/main" xmlns:w14="http://schemas.microsoft.com/office/word/2010/wordml" xmlns:w15="http://schemas.microsoft.com/office/word/2012/wordml" xmlns:w16cex="http://schemas.microsoft.com/office/word/2018/wordml/cex" xmlns:w16cid="http://schemas.microsoft.com/office/word/2016/wordml/cid" xmlns:w16="http://schemas.microsoft.com/office/word/2018/wordml" xmlns:w16du="http://schemas.microsoft.com/office/word/2023/wordml/word16du" xmlns:w16sdtdh="http://schemas.microsoft.com/office/word/2020/wordml/sdtdatahash" xmlns:w16sdtfl="http://schemas.microsoft.com/office/word/2024/wordml/sdtformatlock" xmlns:w16se="http://schemas.microsoft.com/office/word/2015/wordml/symex" xmlns:wpg="http://schemas.microsoft.com/office/word/2010/wordprocessingGroup" xmlns:wpi="http://schemas.microsoft.com/office/word/2010/wordprocessingInk" xmlns:wne="http://schemas.microsoft.com/office/word/2006/wordml" xmlns:wps="http://schemas.microsoft.com/office/word/2010/wordprocessingShape" mc:Ignorable="w14 w15 w16se w16cid w16 w16cex w16sdtdh w16sdtfl w16du wp14">
   <w:abstractNum w:abstractNumId="0" w15:restartNumberingAfterBreak="0">
     <w:nsid w:val="08100D2D"/>
     <w:multiLevelType w:val="hybridMultilevel"/>
@@ -12542,41 +13196,41 @@
       </w:pPr>
     </w:lvl>
   </w:abstractNum>
-  <w:num w:numId="1">
+  <w:num w:numId="1" w16cid:durableId="926424478">
     <w:abstractNumId w:val="8"/>
   </w:num>
-  <w:num w:numId="2">
+  <w:num w:numId="2" w16cid:durableId="510725110">
     <w:abstractNumId w:val="6"/>
   </w:num>
-  <w:num w:numId="3">
+  <w:num w:numId="3" w16cid:durableId="440490835">
     <w:abstractNumId w:val="2"/>
   </w:num>
-  <w:num w:numId="4">
+  <w:num w:numId="4" w16cid:durableId="417680567">
     <w:abstractNumId w:val="4"/>
   </w:num>
-  <w:num w:numId="5">
+  <w:num w:numId="5" w16cid:durableId="622224833">
     <w:abstractNumId w:val="7"/>
   </w:num>
-  <w:num w:numId="6">
+  <w:num w:numId="6" w16cid:durableId="931739201">
     <w:abstractNumId w:val="1"/>
   </w:num>
-  <w:num w:numId="7">
+  <w:num w:numId="7" w16cid:durableId="2109498862">
     <w:abstractNumId w:val="9"/>
   </w:num>
-  <w:num w:numId="8">
+  <w:num w:numId="8" w16cid:durableId="1650019426">
     <w:abstractNumId w:val="3"/>
   </w:num>
-  <w:num w:numId="9">
+  <w:num w:numId="9" w16cid:durableId="1459298947">
     <w:abstractNumId w:val="0"/>
   </w:num>
-  <w:num w:numId="10">
+  <w:num w:numId="10" w16cid:durableId="79645969">
     <w:abstractNumId w:val="5"/>
   </w:num>
 </w:numbering>
 </file>
 
 <file path=word/styles.xml><?xml version="1.0" encoding="utf-8"?>
-<w:styles xmlns:mc="http://schemas.openxmlformats.org/markup-compatibility/2006" xmlns:r="http://schemas.openxmlformats.org/officeDocument/2006/relationships" xmlns:w="http://schemas.openxmlformats.org/wordprocessingml/2006/main" xmlns:w14="http://schemas.microsoft.com/office/word/2010/wordml" xmlns:w15="http://schemas.microsoft.com/office/word/2012/wordml" xmlns:w16cex="http://schemas.microsoft.com/office/word/2018/wordml/cex" xmlns:w16cid="http://schemas.microsoft.com/office/word/2016/wordml/cid" xmlns:w16="http://schemas.microsoft.com/office/word/2018/wordml" xmlns:w16sdtdh="http://schemas.microsoft.com/office/word/2020/wordml/sdtdatahash" xmlns:w16se="http://schemas.microsoft.com/office/word/2015/wordml/symex" mc:Ignorable="w14 w15 w16se w16cid w16 w16cex w16sdtdh">
+<w:styles xmlns:mc="http://schemas.openxmlformats.org/markup-compatibility/2006" xmlns:r="http://schemas.openxmlformats.org/officeDocument/2006/relationships" xmlns:w="http://schemas.openxmlformats.org/wordprocessingml/2006/main" xmlns:w14="http://schemas.microsoft.com/office/word/2010/wordml" xmlns:w15="http://schemas.microsoft.com/office/word/2012/wordml" xmlns:w16cex="http://schemas.microsoft.com/office/word/2018/wordml/cex" xmlns:w16cid="http://schemas.microsoft.com/office/word/2016/wordml/cid" xmlns:w16="http://schemas.microsoft.com/office/word/2018/wordml" xmlns:w16du="http://schemas.microsoft.com/office/word/2023/wordml/word16du" xmlns:w16sdtdh="http://schemas.microsoft.com/office/word/2020/wordml/sdtdatahash" xmlns:w16sdtfl="http://schemas.microsoft.com/office/word/2024/wordml/sdtformatlock" xmlns:w16se="http://schemas.microsoft.com/office/word/2015/wordml/symex" mc:Ignorable="w14 w15 w16se w16cid w16 w16cex w16sdtdh w16sdtfl w16du">
   <w:docDefaults>
     <w:rPrDefault>
       <w:rPr>
@@ -12698,6 +13352,7 @@
     <w:lsdException w:name="HTML Sample" w:semiHidden="1" w:unhideWhenUsed="1"/>
     <w:lsdException w:name="HTML Typewriter" w:semiHidden="1" w:unhideWhenUsed="1"/>
     <w:lsdException w:name="HTML Variable" w:semiHidden="1" w:unhideWhenUsed="1"/>
+    <w:lsdException w:name="Normal Table" w:semiHidden="1" w:unhideWhenUsed="1"/>
     <w:lsdException w:name="annotation subject" w:semiHidden="1" w:unhideWhenUsed="1"/>
     <w:lsdException w:name="No List" w:semiHidden="1" w:unhideWhenUsed="1"/>
     <w:lsdException w:name="Outline List 1" w:semiHidden="1" w:unhideWhenUsed="1"/>
@@ -12744,8 +13399,10 @@
     <w:lsdException w:name="Table Subtle 2" w:semiHidden="1" w:unhideWhenUsed="1"/>
     <w:lsdException w:name="Table Web 1" w:semiHidden="1" w:unhideWhenUsed="1"/>
     <w:lsdException w:name="Table Web 2" w:semiHidden="1" w:unhideWhenUsed="1"/>
+    <w:lsdException w:name="Table Web 3" w:semiHidden="1" w:unhideWhenUsed="1"/>
     <w:lsdException w:name="Balloon Text" w:semiHidden="1" w:unhideWhenUsed="1"/>
     <w:lsdException w:name="Table Grid" w:uiPriority="0"/>
+    <w:lsdException w:name="Table Theme" w:semiHidden="1" w:unhideWhenUsed="1"/>
     <w:lsdException w:name="Placeholder Text" w:semiHidden="1"/>
     <w:lsdException w:name="No Spacing" w:uiPriority="1" w:qFormat="1"/>
     <w:lsdException w:name="Light Shading" w:uiPriority="60"/>

</xml_diff>